<commit_message>
Sync Chapters 8-14 with the uploaded part 2 of the book
Part 2 (217 pages) = Chapters 8-14 with page starts 3, 37, 87, 120, 156, 181,
199. Corrections from the real text: bone's reservoir-of-calcium framing and
levers, osteoblast osteoid rich in type I collagen, osteocyte entrapment and
canaliculi feeding from central canals, endosteum covering all trabeculae,
astrocytes as the most numerous CNS cell, six glial types, muscle from
mesoderm, T-tubule/triad wording at the A-I band boundary, 100,000-150,000 km
of vessels, RBCs 7.5 um by 2.6/0.75 um with 44-45% haematocrit and 5-6 L of
blood, plasma proteins all hepatic, CFU/CSF terminology, reticulocyte nuclear
extrusion, band cells, and the thymic squamous TEC blood-thymus barrier,
stellate TEC cytoreticulum with MHC II, and Hassall corpuscles up to 100 um.

Co-authored-by: arena-agent <297053741+arena-agent@users.noreply.github.com>
</commit_message>
<xml_diff>
--- a/junqueira-exam-guide/Junqueira_Exam_Companion.docx
+++ b/junqueira-exam-guide/Junqueira_Exam_Companion.docx
@@ -1696,7 +1696,7 @@
         <w:pStyle w:val="FirstParagraph"/>
       </w:pPr>
       <w:r>
-        <w:t xml:space="preserve">Every chapter section here corresponds to the printed pages below, so the three books — this guide, the textbook, and your uploaded PDF — can be read side by side. Chapters 1–7 have been checked line by line against</w:t>
+        <w:t xml:space="preserve">Every chapter section here corresponds to the printed pages below, so the three books — this guide, the textbook, and your uploaded PDF — can be read side by side. Chapters 1–7 are checked line by line against</w:t>
       </w:r>
       <w:r>
         <w:t xml:space="preserve"> </w:t>
@@ -1709,7 +1709,23 @@
         <w:t xml:space="preserve">MyDocument_part_1.pdf</w:t>
       </w:r>
       <w:r>
-        <w:t xml:space="preserve">; the remaining chapters are written to the book’s structure and will be checked when their parts are uploaded.</w:t>
+        <w:t xml:space="preserve"> </w:t>
+      </w:r>
+      <w:r>
+        <w:t xml:space="preserve">and Chapters 8–14 against</w:t>
+      </w:r>
+      <w:r>
+        <w:t xml:space="preserve"> </w:t>
+      </w:r>
+      <w:r>
+        <w:rPr>
+          <w:b/>
+          <w:bCs/>
+        </w:rPr>
+        <w:t xml:space="preserve">MyDocument_part_2.pdf</w:t>
+      </w:r>
+      <w:r>
+        <w:t xml:space="preserve">; the remaining chapters are written to the book’s structure and will be checked when part 3 is uploaded.</w:t>
       </w:r>
     </w:p>
     <w:tbl>
@@ -1770,7 +1786,7 @@
               <w:pStyle w:val="Compact"/>
             </w:pPr>
             <w:r>
-              <w:t xml:space="preserve">Your PDF (part 1)</w:t>
+              <w:t xml:space="preserve">Your PDF page</w:t>
             </w:r>
           </w:p>
         </w:tc>
@@ -2226,16 +2242,19 @@
               <w:pStyle w:val="Compact"/>
             </w:pPr>
             <w:r>
-              <w:t xml:space="preserve">part 2 II</w:t>
-            </w:r>
-          </w:p>
-        </w:tc>
-        <w:tc>
-          <w:tcPr/>
-          <w:p>
-            <w:pPr>
-              <w:pStyle w:val="Compact"/>
-            </w:pPr>
+              <w:t xml:space="preserve">p. 3</w:t>
+            </w:r>
+          </w:p>
+        </w:tc>
+        <w:tc>
+          <w:tcPr/>
+          <w:p>
+            <w:pPr>
+              <w:pStyle w:val="Compact"/>
+            </w:pPr>
+            <w:r>
+              <w:t xml:space="preserve">II</w:t>
+            </w:r>
           </w:p>
         </w:tc>
       </w:tr>
@@ -2280,16 +2299,19 @@
               <w:pStyle w:val="Compact"/>
             </w:pPr>
             <w:r>
-              <w:t xml:space="preserve">part 2 II</w:t>
-            </w:r>
-          </w:p>
-        </w:tc>
-        <w:tc>
-          <w:tcPr/>
-          <w:p>
-            <w:pPr>
-              <w:pStyle w:val="Compact"/>
-            </w:pPr>
+              <w:t xml:space="preserve">p. 37</w:t>
+            </w:r>
+          </w:p>
+        </w:tc>
+        <w:tc>
+          <w:tcPr/>
+          <w:p>
+            <w:pPr>
+              <w:pStyle w:val="Compact"/>
+            </w:pPr>
+            <w:r>
+              <w:t xml:space="preserve">II</w:t>
+            </w:r>
           </w:p>
         </w:tc>
       </w:tr>
@@ -2334,16 +2356,19 @@
               <w:pStyle w:val="Compact"/>
             </w:pPr>
             <w:r>
-              <w:t xml:space="preserve">part 2 II</w:t>
-            </w:r>
-          </w:p>
-        </w:tc>
-        <w:tc>
-          <w:tcPr/>
-          <w:p>
-            <w:pPr>
-              <w:pStyle w:val="Compact"/>
-            </w:pPr>
+              <w:t xml:space="preserve">p. 87</w:t>
+            </w:r>
+          </w:p>
+        </w:tc>
+        <w:tc>
+          <w:tcPr/>
+          <w:p>
+            <w:pPr>
+              <w:pStyle w:val="Compact"/>
+            </w:pPr>
+            <w:r>
+              <w:t xml:space="preserve">II</w:t>
+            </w:r>
           </w:p>
         </w:tc>
       </w:tr>
@@ -2388,16 +2413,19 @@
               <w:pStyle w:val="Compact"/>
             </w:pPr>
             <w:r>
-              <w:t xml:space="preserve">part 2 III</w:t>
-            </w:r>
-          </w:p>
-        </w:tc>
-        <w:tc>
-          <w:tcPr/>
-          <w:p>
-            <w:pPr>
-              <w:pStyle w:val="Compact"/>
-            </w:pPr>
+              <w:t xml:space="preserve">p. 120</w:t>
+            </w:r>
+          </w:p>
+        </w:tc>
+        <w:tc>
+          <w:tcPr/>
+          <w:p>
+            <w:pPr>
+              <w:pStyle w:val="Compact"/>
+            </w:pPr>
+            <w:r>
+              <w:t xml:space="preserve">III</w:t>
+            </w:r>
           </w:p>
         </w:tc>
       </w:tr>
@@ -2442,16 +2470,19 @@
               <w:pStyle w:val="Compact"/>
             </w:pPr>
             <w:r>
-              <w:t xml:space="preserve">part 2 III</w:t>
-            </w:r>
-          </w:p>
-        </w:tc>
-        <w:tc>
-          <w:tcPr/>
-          <w:p>
-            <w:pPr>
-              <w:pStyle w:val="Compact"/>
-            </w:pPr>
+              <w:t xml:space="preserve">p. 156</w:t>
+            </w:r>
+          </w:p>
+        </w:tc>
+        <w:tc>
+          <w:tcPr/>
+          <w:p>
+            <w:pPr>
+              <w:pStyle w:val="Compact"/>
+            </w:pPr>
+            <w:r>
+              <w:t xml:space="preserve">III</w:t>
+            </w:r>
           </w:p>
         </w:tc>
       </w:tr>
@@ -2496,16 +2527,19 @@
               <w:pStyle w:val="Compact"/>
             </w:pPr>
             <w:r>
-              <w:t xml:space="preserve">part 2 III</w:t>
-            </w:r>
-          </w:p>
-        </w:tc>
-        <w:tc>
-          <w:tcPr/>
-          <w:p>
-            <w:pPr>
-              <w:pStyle w:val="Compact"/>
-            </w:pPr>
+              <w:t xml:space="preserve">p. 181</w:t>
+            </w:r>
+          </w:p>
+        </w:tc>
+        <w:tc>
+          <w:tcPr/>
+          <w:p>
+            <w:pPr>
+              <w:pStyle w:val="Compact"/>
+            </w:pPr>
+            <w:r>
+              <w:t xml:space="preserve">III</w:t>
+            </w:r>
           </w:p>
         </w:tc>
       </w:tr>
@@ -2550,16 +2584,19 @@
               <w:pStyle w:val="Compact"/>
             </w:pPr>
             <w:r>
-              <w:t xml:space="preserve">part 2 III</w:t>
-            </w:r>
-          </w:p>
-        </w:tc>
-        <w:tc>
-          <w:tcPr/>
-          <w:p>
-            <w:pPr>
-              <w:pStyle w:val="Compact"/>
-            </w:pPr>
+              <w:t xml:space="preserve">p. 199</w:t>
+            </w:r>
+          </w:p>
+        </w:tc>
+        <w:tc>
+          <w:tcPr/>
+          <w:p>
+            <w:pPr>
+              <w:pStyle w:val="Compact"/>
+            </w:pPr>
+            <w:r>
+              <w:t xml:space="preserve">III</w:t>
+            </w:r>
           </w:p>
         </w:tc>
       </w:tr>
@@ -2604,7 +2641,7 @@
               <w:pStyle w:val="Compact"/>
             </w:pPr>
             <w:r>
-              <w:t xml:space="preserve">part 2 IV</w:t>
+              <w:t xml:space="preserve">part 3 IV</w:t>
             </w:r>
           </w:p>
         </w:tc>
@@ -2658,7 +2695,7 @@
               <w:pStyle w:val="Compact"/>
             </w:pPr>
             <w:r>
-              <w:t xml:space="preserve">part 2 IV</w:t>
+              <w:t xml:space="preserve">part 3 IV</w:t>
             </w:r>
           </w:p>
         </w:tc>
@@ -2712,7 +2749,7 @@
               <w:pStyle w:val="Compact"/>
             </w:pPr>
             <w:r>
-              <w:t xml:space="preserve">part 2 IV</w:t>
+              <w:t xml:space="preserve">part 3 IV</w:t>
             </w:r>
           </w:p>
         </w:tc>
@@ -2766,7 +2803,7 @@
               <w:pStyle w:val="Compact"/>
             </w:pPr>
             <w:r>
-              <w:t xml:space="preserve">part 2 IV</w:t>
+              <w:t xml:space="preserve">part 3 IV</w:t>
             </w:r>
           </w:p>
         </w:tc>
@@ -2820,7 +2857,7 @@
               <w:pStyle w:val="Compact"/>
             </w:pPr>
             <w:r>
-              <w:t xml:space="preserve">part 2 V</w:t>
+              <w:t xml:space="preserve">part 3 V</w:t>
             </w:r>
           </w:p>
         </w:tc>
@@ -2874,7 +2911,7 @@
               <w:pStyle w:val="Compact"/>
             </w:pPr>
             <w:r>
-              <w:t xml:space="preserve">part 2 V</w:t>
+              <w:t xml:space="preserve">part 3 V</w:t>
             </w:r>
           </w:p>
         </w:tc>
@@ -2928,7 +2965,7 @@
               <w:pStyle w:val="Compact"/>
             </w:pPr>
             <w:r>
-              <w:t xml:space="preserve">part 2 V</w:t>
+              <w:t xml:space="preserve">part 3 V</w:t>
             </w:r>
           </w:p>
         </w:tc>
@@ -2982,7 +3019,7 @@
               <w:pStyle w:val="Compact"/>
             </w:pPr>
             <w:r>
-              <w:t xml:space="preserve">part 2 V</w:t>
+              <w:t xml:space="preserve">part 3 V</w:t>
             </w:r>
           </w:p>
         </w:tc>
@@ -3036,7 +3073,7 @@
               <w:pStyle w:val="Compact"/>
             </w:pPr>
             <w:r>
-              <w:t xml:space="preserve">part 2 V</w:t>
+              <w:t xml:space="preserve">part 3 V</w:t>
             </w:r>
           </w:p>
         </w:tc>
@@ -3090,7 +3127,7 @@
               <w:pStyle w:val="Compact"/>
             </w:pPr>
             <w:r>
-              <w:t xml:space="preserve">part 2</w:t>
+              <w:t xml:space="preserve">part 3</w:t>
             </w:r>
           </w:p>
         </w:tc>
@@ -15809,7 +15846,7 @@
         <w:t xml:space="preserve"> </w:t>
       </w:r>
       <w:r>
-        <w:t xml:space="preserve">· Bone Cells · Bone Matrix · Periosteum &amp; Endosteum · Types of Bone · Osteogenesis · Bone Remodeling &amp; Repair · Metabolic Role of Bone · Joints</w:t>
+        <w:t xml:space="preserve">· Part 2, pages 3–36 · Bone Cells · Bone Matrix · Periosteum &amp; Endosteum · Types of Bone · Osteogenesis · Bone Remodeling &amp; Repair · Metabolic Role of Bone · Joints</w:t>
       </w:r>
     </w:p>
     <w:bookmarkStart w:id="72" w:name="the-core-idea-7"/>
@@ -15826,20 +15863,75 @@
         <w:pStyle w:val="FirstParagraph"/>
       </w:pPr>
       <w:r>
-        <w:t xml:space="preserve">Bone is a</w:t>
-      </w:r>
-      <w:r>
-        <w:t xml:space="preserve"> </w:t>
-      </w:r>
-      <w:r>
-        <w:rPr>
-          <w:b/>
-          <w:bCs/>
-        </w:rPr>
-        <w:t xml:space="preserve">living composite material</w:t>
-      </w:r>
-      <w:r>
-        <w:t xml:space="preserve">. Its stiffness comes from mineral (hydroxyapatite), its toughness from collagen, and its capacity to adapt comes from four cell types that continuously demolish and rebuild it. Every skeletal disease is a failure of one of those four cells, or of the balance between them.</w:t>
+        <w:t xml:space="preserve">Bone is the main constituent of the adult skeleton: it gives</w:t>
+      </w:r>
+      <w:r>
+        <w:t xml:space="preserve"> </w:t>
+      </w:r>
+      <w:r>
+        <w:rPr>
+          <w:b/>
+          <w:bCs/>
+        </w:rPr>
+        <w:t xml:space="preserve">solid support</w:t>
+      </w:r>
+      <w:r>
+        <w:t xml:space="preserve">, protects vital organs of the cranial and thoracic cavities, encloses</w:t>
+      </w:r>
+      <w:r>
+        <w:t xml:space="preserve"> </w:t>
+      </w:r>
+      <w:r>
+        <w:rPr>
+          <w:b/>
+          <w:bCs/>
+        </w:rPr>
+        <w:t xml:space="preserve">medullary cavities</w:t>
+      </w:r>
+      <w:r>
+        <w:t xml:space="preserve"> </w:t>
+      </w:r>
+      <w:r>
+        <w:t xml:space="preserve">where blood cells form, and acts as a</w:t>
+      </w:r>
+      <w:r>
+        <w:t xml:space="preserve"> </w:t>
+      </w:r>
+      <w:r>
+        <w:rPr>
+          <w:b/>
+          <w:bCs/>
+        </w:rPr>
+        <w:t xml:space="preserve">reservoir of calcium and phosphate</w:t>
+      </w:r>
+      <w:r>
+        <w:t xml:space="preserve">, storing or releasing them to keep body fluid concentrations constant. It also forms a system of</w:t>
+      </w:r>
+      <w:r>
+        <w:t xml:space="preserve"> </w:t>
+      </w:r>
+      <w:r>
+        <w:rPr>
+          <w:b/>
+          <w:bCs/>
+        </w:rPr>
+        <w:t xml:space="preserve">levers</w:t>
+      </w:r>
+      <w:r>
+        <w:t xml:space="preserve"> </w:t>
+      </w:r>
+      <w:r>
+        <w:t xml:space="preserve">that multiply the force of muscle contraction into movement. Its stiffness comes from mineral, its toughness from collagen, and its capacity to adapt from four cell types that continuously demolish and rebuild it —</w:t>
+      </w:r>
+      <w:r>
+        <w:t xml:space="preserve"> </w:t>
+      </w:r>
+      <w:r>
+        <w:rPr>
+          <w:b/>
+          <w:bCs/>
+        </w:rPr>
+        <w:t xml:space="preserve">every skeletal disease is a failure of one of those cells, or of the balance between them.</w:t>
       </w:r>
     </w:p>
     <w:bookmarkEnd w:id="72"/>
@@ -15987,25 +16079,47 @@
               <w:pStyle w:val="Compact"/>
             </w:pPr>
             <w:r>
-              <w:t xml:space="preserve">Osteoprogenitor</w:t>
-            </w:r>
-          </w:p>
-        </w:tc>
-        <w:tc>
-          <w:tcPr/>
-          <w:p>
-            <w:pPr>
-              <w:pStyle w:val="Compact"/>
-            </w:pPr>
+              <w:t xml:space="preserve">Osteoprogenitor (periosteum, endosteum)</w:t>
+            </w:r>
+          </w:p>
+        </w:tc>
+        <w:tc>
+          <w:tcPr/>
+          <w:p>
+            <w:pPr>
+              <w:pStyle w:val="Compact"/>
+            </w:pPr>
+            <w:r>
+              <w:t xml:space="preserve">Secrete</w:t>
+            </w:r>
+            <w:r>
+              <w:t xml:space="preserve"> </w:t>
+            </w:r>
             <w:r>
               <w:rPr>
                 <w:b/>
                 <w:bCs/>
               </w:rPr>
-              <w:t xml:space="preserve">Synthesise osteoid</w:t>
-            </w:r>
-            <w:r>
-              <w:t xml:space="preserve">; mineralise; regulate osteoclasts via</w:t>
+              <w:t xml:space="preserve">osteoid</w:t>
+            </w:r>
+            <w:r>
+              <w:t xml:space="preserve">, rich in</w:t>
+            </w:r>
+            <w:r>
+              <w:t xml:space="preserve"> </w:t>
+            </w:r>
+            <w:r>
+              <w:rPr>
+                <w:b/>
+                <w:bCs/>
+              </w:rPr>
+              <w:t xml:space="preserve">type I collagen</w:t>
+            </w:r>
+            <w:r>
+              <w:t xml:space="preserve"> </w:t>
+            </w:r>
+            <w:r>
+              <w:t xml:space="preserve">plus proteoglycans; mineralise it; regulate osteoclasts via</w:t>
             </w:r>
             <w:r>
               <w:t xml:space="preserve"> </w:t>
@@ -16026,7 +16140,7 @@
               <w:pStyle w:val="Compact"/>
             </w:pPr>
             <w:r>
-              <w:t xml:space="preserve">Cuboidal, basophilic, aligned on bone surface;</w:t>
+              <w:t xml:space="preserve">Cuboidal, basophilic, cover existing bone surfaces;</w:t>
             </w:r>
             <w:r>
               <w:t xml:space="preserve"> </w:t>
@@ -16226,6 +16340,72 @@
         <w:pStyle w:val="BodyText"/>
       </w:pPr>
       <w:r>
+        <w:t xml:space="preserve">As osteoid calcifies and hardens it</w:t>
+      </w:r>
+      <w:r>
+        <w:t xml:space="preserve"> </w:t>
+      </w:r>
+      <w:r>
+        <w:rPr>
+          <w:b/>
+          <w:bCs/>
+        </w:rPr>
+        <w:t xml:space="preserve">entraps some osteoblasts</w:t>
+      </w:r>
+      <w:r>
+        <w:t xml:space="preserve">, which then differentiate into osteocytes sitting in</w:t>
+      </w:r>
+      <w:r>
+        <w:t xml:space="preserve"> </w:t>
+      </w:r>
+      <w:r>
+        <w:rPr>
+          <w:b/>
+          <w:bCs/>
+        </w:rPr>
+        <w:t xml:space="preserve">lacunae</w:t>
+      </w:r>
+      <w:r>
+        <w:t xml:space="preserve"> </w:t>
+      </w:r>
+      <w:r>
+        <w:t xml:space="preserve">between the lamellae, with cytoplasmic processes in</w:t>
+      </w:r>
+      <w:r>
+        <w:t xml:space="preserve"> </w:t>
+      </w:r>
+      <w:r>
+        <w:rPr>
+          <w:b/>
+          <w:bCs/>
+        </w:rPr>
+        <w:t xml:space="preserve">canaliculi</w:t>
+      </w:r>
+      <w:r>
+        <w:t xml:space="preserve">. Osteocytes maintain the calcified matrix and are fed from microvasculature in the</w:t>
+      </w:r>
+      <w:r>
+        <w:t xml:space="preserve"> </w:t>
+      </w:r>
+      <w:r>
+        <w:rPr>
+          <w:b/>
+          <w:bCs/>
+        </w:rPr>
+        <w:t xml:space="preserve">central canals of osteons</w:t>
+      </w:r>
+      <w:r>
+        <w:t xml:space="preserve"> </w:t>
+      </w:r>
+      <w:r>
+        <w:t xml:space="preserve">through those canaliculi.</w:t>
+      </w:r>
+    </w:p>
+    <w:p>
+      <w:pPr>
+        <w:pStyle w:val="BodyText"/>
+      </w:pPr>
+      <w:r>
         <w:rPr>
           <w:b/>
           <w:bCs/>
@@ -16236,7 +16416,23 @@
         <w:t xml:space="preserve"> </w:t>
       </w:r>
       <w:r>
-        <w:t xml:space="preserve">Every other bone cell is mesenchymal; the osteoclast is haematopoietic. It dissolves mineral by pumping H⁺ and digests collagen with cathepsin K.</w:t>
+        <w:t xml:space="preserve">Every other bone cell is mesenchymal; the osteoclast is</w:t>
+      </w:r>
+      <w:r>
+        <w:t xml:space="preserve"> </w:t>
+      </w:r>
+      <w:r>
+        <w:rPr>
+          <w:b/>
+          <w:bCs/>
+        </w:rPr>
+        <w:t xml:space="preserve">monocyte-derived</w:t>
+      </w:r>
+      <w:r>
+        <w:t xml:space="preserve"> </w:t>
+      </w:r>
+      <w:r>
+        <w:t xml:space="preserve">and is the cell required for bone remodeling. It dissolves mineral by pumping H⁺ and digests collagen with cathepsin K.</w:t>
       </w:r>
     </w:p>
     <w:p>
@@ -16460,39 +16656,55 @@
         <w:t xml:space="preserve"> </w:t>
       </w:r>
       <w:r>
-        <w:t xml:space="preserve">— outer fibrous layer plus inner</w:t>
-      </w:r>
-      <w:r>
-        <w:t xml:space="preserve"> </w:t>
-      </w:r>
-      <w:r>
-        <w:rPr>
-          <w:b/>
-          <w:bCs/>
-        </w:rPr>
-        <w:t xml:space="preserve">osteogenic (cambium)</w:t>
-      </w:r>
-      <w:r>
-        <w:t xml:space="preserve"> </w:t>
-      </w:r>
-      <w:r>
-        <w:t xml:space="preserve">layer; absent on articular surfaces and at tendon insertions.</w:t>
-      </w:r>
-      <w:r>
-        <w:t xml:space="preserve"> </w:t>
-      </w:r>
-      <w:r>
-        <w:rPr>
-          <w:b/>
-          <w:bCs/>
-        </w:rPr>
-        <w:t xml:space="preserve">Endosteum</w:t>
-      </w:r>
-      <w:r>
-        <w:t xml:space="preserve"> </w:t>
-      </w:r>
-      <w:r>
-        <w:t xml:space="preserve">lines the marrow cavity. Both are sources of osteoprogenitor cells for growth and repair.</w:t>
+        <w:t xml:space="preserve">— dense connective tissue with a mainly</w:t>
+      </w:r>
+      <w:r>
+        <w:t xml:space="preserve"> </w:t>
+      </w:r>
+      <w:r>
+        <w:rPr>
+          <w:b/>
+          <w:bCs/>
+        </w:rPr>
+        <w:t xml:space="preserve">fibrous layer</w:t>
+      </w:r>
+      <w:r>
+        <w:t xml:space="preserve"> </w:t>
+      </w:r>
+      <w:r>
+        <w:t xml:space="preserve">over a more</w:t>
+      </w:r>
+      <w:r>
+        <w:t xml:space="preserve"> </w:t>
+      </w:r>
+      <w:r>
+        <w:rPr>
+          <w:b/>
+          <w:bCs/>
+        </w:rPr>
+        <w:t xml:space="preserve">cellular</w:t>
+      </w:r>
+      <w:r>
+        <w:t xml:space="preserve"> </w:t>
+      </w:r>
+      <w:r>
+        <w:t xml:space="preserve">layer; small vessels penetrate the matrix from it. Absent on articular surfaces and at tendon insertions.</w:t>
+      </w:r>
+      <w:r>
+        <w:t xml:space="preserve"> </w:t>
+      </w:r>
+      <w:r>
+        <w:rPr>
+          <w:b/>
+          <w:bCs/>
+        </w:rPr>
+        <w:t xml:space="preserve">Endosteum covers all trabeculae around the marrow cavities</w:t>
+      </w:r>
+      <w:r>
+        <w:t xml:space="preserve"> </w:t>
+      </w:r>
+      <w:r>
+        <w:t xml:space="preserve">— not merely the shaft. Both are sources of osteoprogenitor cells for growth and repair.</w:t>
       </w:r>
     </w:p>
     <w:bookmarkEnd w:id="75"/>
@@ -17870,7 +18082,7 @@
         <w:t xml:space="preserve"> </w:t>
       </w:r>
       <w:r>
-        <w:t xml:space="preserve">· Development of Nerve Tissue · Neurons · Glial Cells &amp; Neuronal Activity · Central Nervous System · Peripheral Nervous System · Neural Plasticity &amp; Regeneration</w:t>
+        <w:t xml:space="preserve">· Part 2, pages 37–86 · Development of Nerve Tissue · Neurons · Glial Cells &amp; Neuronal Activity · Central Nervous System · Peripheral Nervous System · Neural Plasticity &amp; Regeneration</w:t>
       </w:r>
     </w:p>
     <w:bookmarkStart w:id="82" w:name="the-core-idea-8"/>
@@ -18334,23 +18546,14 @@
               <w:pStyle w:val="Compact"/>
             </w:pPr>
             <w:r>
-              <w:t xml:space="preserve">Structural support,</w:t>
-            </w:r>
-            <w:r>
-              <w:t xml:space="preserve"> </w:t>
-            </w:r>
-            <w:r>
               <w:rPr>
                 <w:b/>
                 <w:bCs/>
               </w:rPr>
-              <w:t xml:space="preserve">blood–brain barrier</w:t>
-            </w:r>
-            <w:r>
-              <w:t xml:space="preserve"> </w:t>
-            </w:r>
-            <w:r>
-              <w:t xml:space="preserve">induction, K⁺ buffering, glutamate uptake, glial scar</w:t>
+              <w:t xml:space="preserve">The most numerous cell of the CNS</w:t>
+            </w:r>
+            <w:r>
+              <w:t xml:space="preserve">; hundreds of processes enclose neuronal perikarya, synapses, and capillaries, providing regulated microenvironments</w:t>
             </w:r>
           </w:p>
         </w:tc>
@@ -18368,7 +18571,7 @@
               <w:t xml:space="preserve">GFAP</w:t>
             </w:r>
             <w:r>
-              <w:t xml:space="preserve">; foot processes on capillaries</w:t>
+              <w:t xml:space="preserve">; foot processes on capillaries; glial scar</w:t>
             </w:r>
           </w:p>
         </w:tc>
@@ -18407,11 +18610,17 @@
               <w:pStyle w:val="Compact"/>
             </w:pPr>
             <w:r>
+              <w:t xml:space="preserve">Wraps flattened processes around portions of axons, forming</w:t>
+            </w:r>
+            <w:r>
+              <w:t xml:space="preserve"> </w:t>
+            </w:r>
+            <w:r>
               <w:rPr>
                 <w:b/>
                 <w:bCs/>
               </w:rPr>
-              <w:t xml:space="preserve">Myelinates multiple axons</w:t>
+              <w:t xml:space="preserve">myelin sheaths</w:t>
             </w:r>
           </w:p>
         </w:tc>
@@ -18647,17 +18856,36 @@
         <w:pStyle w:val="BodyText"/>
       </w:pPr>
       <w:r>
-        <w:rPr>
-          <w:b/>
-          <w:bCs/>
-        </w:rPr>
-        <w:t xml:space="preserve">Myelination.</w:t>
-      </w:r>
-      <w:r>
-        <w:t xml:space="preserve"> </w:t>
-      </w:r>
-      <w:r>
-        <w:t xml:space="preserve">In the PNS a Schwann cell wraps one axon segment; in the CNS an oligodendrocyte wraps several. The gaps are</w:t>
+        <w:t xml:space="preserve">The book counts</w:t>
+      </w:r>
+      <w:r>
+        <w:t xml:space="preserve"> </w:t>
+      </w:r>
+      <w:r>
+        <w:rPr>
+          <w:b/>
+          <w:bCs/>
+        </w:rPr>
+        <w:t xml:space="preserve">six major glial types</w:t>
+      </w:r>
+      <w:r>
+        <w:t xml:space="preserve">: oligodendrocytes, astrocytes, ependymal cells, and microglia in the CNS; Schwann cells and satellite cells in the PNS.</w:t>
+      </w:r>
+      <w:r>
+        <w:t xml:space="preserve"> </w:t>
+      </w:r>
+      <w:r>
+        <w:rPr>
+          <w:b/>
+          <w:bCs/>
+        </w:rPr>
+        <w:t xml:space="preserve">Myelination:</w:t>
+      </w:r>
+      <w:r>
+        <w:t xml:space="preserve"> </w:t>
+      </w:r>
+      <w:r>
+        <w:t xml:space="preserve">in the PNS a Schwann cell wraps one axon segment; in the CNS an oligodendrocyte wraps several. The gaps are</w:t>
       </w:r>
       <w:r>
         <w:t xml:space="preserve"> </w:t>
@@ -19350,7 +19578,7 @@
         <w:t xml:space="preserve"> </w:t>
       </w:r>
       <w:r>
-        <w:t xml:space="preserve">· Skeletal Muscle · Cardiac Muscle · Smooth Muscle · Regeneration of Muscle Tissue</w:t>
+        <w:t xml:space="preserve">· Part 2, pages 87–119 · Skeletal Muscle · Cardiac Muscle · Smooth Muscle · Regeneration of Muscle Tissue</w:t>
       </w:r>
     </w:p>
     <w:bookmarkStart w:id="90" w:name="the-core-idea-9"/>
@@ -19367,7 +19595,49 @@
         <w:pStyle w:val="FirstParagraph"/>
       </w:pPr>
       <w:r>
-        <w:t xml:space="preserve">Muscle converts chemical energy into directed force. All three types use the same actin–myosin interaction, but arrange it differently:</w:t>
+        <w:t xml:space="preserve">Muscle tissue consists of cells that optimise the universal cell property of</w:t>
+      </w:r>
+      <w:r>
+        <w:t xml:space="preserve"> </w:t>
+      </w:r>
+      <w:r>
+        <w:rPr>
+          <w:b/>
+          <w:bCs/>
+        </w:rPr>
+        <w:t xml:space="preserve">contractility</w:t>
+      </w:r>
+      <w:r>
+        <w:t xml:space="preserve">. Essentially</w:t>
+      </w:r>
+      <w:r>
+        <w:t xml:space="preserve"> </w:t>
+      </w:r>
+      <w:r>
+        <w:rPr>
+          <w:b/>
+          <w:bCs/>
+        </w:rPr>
+        <w:t xml:space="preserve">all muscle cells originate from embryonic mesoderm</w:t>
+      </w:r>
+      <w:r>
+        <w:t xml:space="preserve"> </w:t>
+      </w:r>
+      <w:r>
+        <w:t xml:space="preserve">and differentiate by elongation and abundant synthesis of the myofibrillar proteins</w:t>
+      </w:r>
+      <w:r>
+        <w:t xml:space="preserve"> </w:t>
+      </w:r>
+      <w:r>
+        <w:rPr>
+          <w:b/>
+          <w:bCs/>
+        </w:rPr>
+        <w:t xml:space="preserve">actin and myosin</w:t>
+      </w:r>
+      <w:r>
+        <w:t xml:space="preserve">. All three types use the same actin–myosin interaction but arrange it differently:</w:t>
       </w:r>
       <w:r>
         <w:t xml:space="preserve"> </w:t>
@@ -19843,36 +20113,49 @@
         <w:t xml:space="preserve"> </w:t>
       </w:r>
       <w:r>
-        <w:t xml:space="preserve">invaginate at the</w:t>
-      </w:r>
-      <w:r>
-        <w:t xml:space="preserve"> </w:t>
-      </w:r>
-      <w:r>
-        <w:rPr>
-          <w:b/>
-          <w:bCs/>
-        </w:rPr>
-        <w:t xml:space="preserve">A–I junction</w:t>
-      </w:r>
-      <w:r>
-        <w:t xml:space="preserve">, forming</w:t>
-      </w:r>
-      <w:r>
-        <w:t xml:space="preserve"> </w:t>
-      </w:r>
-      <w:r>
-        <w:rPr>
-          <w:b/>
-          <w:bCs/>
-        </w:rPr>
-        <w:t xml:space="preserve">triads</w:t>
-      </w:r>
-      <w:r>
-        <w:t xml:space="preserve"> </w:t>
-      </w:r>
-      <w:r>
-        <w:t xml:space="preserve">(one T-tubule + two terminal cisternae). An action potential releases Ca²⁺, which binds</w:t>
+        <w:t xml:space="preserve">are invaginations of the sarcolemma that encircle each myofibril</w:t>
+      </w:r>
+      <w:r>
+        <w:t xml:space="preserve"> </w:t>
+      </w:r>
+      <w:r>
+        <w:rPr>
+          <w:b/>
+          <w:bCs/>
+        </w:rPr>
+        <w:t xml:space="preserve">near the aligned A- and I-band boundaries</w:t>
+      </w:r>
+      <w:r>
+        <w:t xml:space="preserve">, where each T-tubule associates with</w:t>
+      </w:r>
+      <w:r>
+        <w:t xml:space="preserve"> </w:t>
+      </w:r>
+      <w:r>
+        <w:rPr>
+          <w:b/>
+          <w:bCs/>
+        </w:rPr>
+        <w:t xml:space="preserve">two terminal cisternae</w:t>
+      </w:r>
+      <w:r>
+        <w:t xml:space="preserve"> </w:t>
+      </w:r>
+      <w:r>
+        <w:t xml:space="preserve">— a</w:t>
+      </w:r>
+      <w:r>
+        <w:t xml:space="preserve"> </w:t>
+      </w:r>
+      <w:r>
+        <w:rPr>
+          <w:b/>
+          <w:bCs/>
+        </w:rPr>
+        <w:t xml:space="preserve">triad</w:t>
+      </w:r>
+      <w:r>
+        <w:t xml:space="preserve">. Depolarisation spreads along the T-tubules to trigger simultaneous Ca²⁺ release throughout the fibre. An action potential releases Ca²⁺, which binds</w:t>
       </w:r>
       <w:r>
         <w:t xml:space="preserve"> </w:t>
@@ -21471,7 +21754,7 @@
         <w:t xml:space="preserve"> </w:t>
       </w:r>
       <w:r>
-        <w:t xml:space="preserve">· Heart · Tissues of the Vascular Wall · Vasculature · Lymphatic Vascular System</w:t>
+        <w:t xml:space="preserve">· Part 2, pages 120–155 · Heart · Tissues of the Vascular Wall · Vasculature · Lymphatic Vascular System</w:t>
       </w:r>
     </w:p>
     <w:bookmarkStart w:id="97" w:name="the-core-idea-10"/>
@@ -21488,7 +21771,20 @@
         <w:pStyle w:val="FirstParagraph"/>
       </w:pPr>
       <w:r>
-        <w:t xml:space="preserve">Every vessel in the body is a variation on one three-layered tube. What changes between an aorta and a capillary is</w:t>
+        <w:t xml:space="preserve">The circulatory system pumps and directs blood cells and substances to all tissues, and in an adult the total length of its vessels is estimated at</w:t>
+      </w:r>
+      <w:r>
+        <w:t xml:space="preserve"> </w:t>
+      </w:r>
+      <w:r>
+        <w:rPr>
+          <w:b/>
+          <w:bCs/>
+        </w:rPr>
+        <w:t xml:space="preserve">100,000–150,000 km</w:t>
+      </w:r>
+      <w:r>
+        <w:t xml:space="preserve">. Every vessel in the body is a variation on one three-layered tube. What changes between an aorta and a capillary is</w:t>
       </w:r>
       <w:r>
         <w:t xml:space="preserve"> </w:t>
@@ -23052,7 +23348,7 @@
         <w:t xml:space="preserve"> </w:t>
       </w:r>
       <w:r>
-        <w:t xml:space="preserve">· Composition of Plasma · Blood Cells</w:t>
+        <w:t xml:space="preserve">· Part 2, pages 156–180 · Composition of Plasma · Blood Cells</w:t>
       </w:r>
     </w:p>
     <w:bookmarkStart w:id="103" w:name="the-core-idea-11"/>
@@ -23097,55 +23393,62 @@
         <w:pStyle w:val="FirstParagraph"/>
       </w:pPr>
       <w:r>
-        <w:t xml:space="preserve">About 55% of blood volume. Water (90%), plasma proteins —</w:t>
-      </w:r>
-      <w:r>
-        <w:t xml:space="preserve"> </w:t>
-      </w:r>
-      <w:r>
-        <w:rPr>
-          <w:b/>
-          <w:bCs/>
-        </w:rPr>
-        <w:t xml:space="preserve">albumin</w:t>
-      </w:r>
-      <w:r>
-        <w:t xml:space="preserve"> </w:t>
-      </w:r>
-      <w:r>
-        <w:t xml:space="preserve">(osmotic pressure, carrier),</w:t>
-      </w:r>
-      <w:r>
-        <w:t xml:space="preserve"> </w:t>
-      </w:r>
-      <w:r>
-        <w:rPr>
-          <w:b/>
-          <w:bCs/>
-        </w:rPr>
-        <w:t xml:space="preserve">globulins</w:t>
-      </w:r>
-      <w:r>
-        <w:t xml:space="preserve"> </w:t>
-      </w:r>
-      <w:r>
-        <w:t xml:space="preserve">(transport, immunoglobulins),</w:t>
-      </w:r>
-      <w:r>
-        <w:t xml:space="preserve"> </w:t>
-      </w:r>
-      <w:r>
-        <w:rPr>
-          <w:b/>
-          <w:bCs/>
-        </w:rPr>
-        <w:t xml:space="preserve">fibrinogen</w:t>
-      </w:r>
-      <w:r>
-        <w:t xml:space="preserve"> </w:t>
-      </w:r>
-      <w:r>
-        <w:t xml:space="preserve">(clotting) — plus electrolytes, nutrients, hormones, and waste.</w:t>
+        <w:t xml:space="preserve">About 55% of blood volume. Water plus plasma proteins —</w:t>
+      </w:r>
+      <w:r>
+        <w:t xml:space="preserve"> </w:t>
+      </w:r>
+      <w:r>
+        <w:rPr>
+          <w:b/>
+          <w:bCs/>
+        </w:rPr>
+        <w:t xml:space="preserve">albumin, α- and β-globulins, complement proteins, and fibrinogen</w:t>
+      </w:r>
+      <w:r>
+        <w:t xml:space="preserve">, all secreted in the</w:t>
+      </w:r>
+      <w:r>
+        <w:t xml:space="preserve"> </w:t>
+      </w:r>
+      <w:r>
+        <w:rPr>
+          <w:b/>
+          <w:bCs/>
+        </w:rPr>
+        <w:t xml:space="preserve">liver</w:t>
+      </w:r>
+      <w:r>
+        <w:t xml:space="preserve">, plus the</w:t>
+      </w:r>
+      <w:r>
+        <w:t xml:space="preserve"> </w:t>
+      </w:r>
+      <w:r>
+        <w:rPr>
+          <w:b/>
+          <w:bCs/>
+        </w:rPr>
+        <w:t xml:space="preserve">immunoglobulins</w:t>
+      </w:r>
+      <w:r>
+        <w:t xml:space="preserve"> </w:t>
+      </w:r>
+      <w:r>
+        <w:t xml:space="preserve">— and electrolytes, nutrients, hormones, and waste. On clotting, some proteins are consumed and others are released from platelets, leaving</w:t>
+      </w:r>
+      <w:r>
+        <w:t xml:space="preserve"> </w:t>
+      </w:r>
+      <w:r>
+        <w:rPr>
+          <w:b/>
+          <w:bCs/>
+        </w:rPr>
+        <w:t xml:space="preserve">serum</w:t>
+      </w:r>
+      <w:r>
+        <w:t xml:space="preserve">, whose biological properties differ from plasma.</w:t>
       </w:r>
       <w:r>
         <w:t xml:space="preserve"> </w:t>
@@ -23202,7 +23505,55 @@
         <w:t xml:space="preserve">Biconcave disc</w:t>
       </w:r>
       <w:r>
-        <w:t xml:space="preserve">, 7–8 µm,</w:t>
+        <w:t xml:space="preserve">,</w:t>
+      </w:r>
+      <w:r>
+        <w:t xml:space="preserve"> </w:t>
+      </w:r>
+      <w:r>
+        <w:rPr>
+          <w:b/>
+          <w:bCs/>
+        </w:rPr>
+        <w:t xml:space="preserve">7.5 µm</w:t>
+      </w:r>
+      <w:r>
+        <w:t xml:space="preserve"> </w:t>
+      </w:r>
+      <w:r>
+        <w:t xml:space="preserve">in diameter,</w:t>
+      </w:r>
+      <w:r>
+        <w:t xml:space="preserve"> </w:t>
+      </w:r>
+      <w:r>
+        <w:rPr>
+          <w:b/>
+          <w:bCs/>
+        </w:rPr>
+        <w:t xml:space="preserve">2.6 µm</w:t>
+      </w:r>
+      <w:r>
+        <w:t xml:space="preserve"> </w:t>
+      </w:r>
+      <w:r>
+        <w:t xml:space="preserve">thick at the rim but only</w:t>
+      </w:r>
+      <w:r>
+        <w:t xml:space="preserve"> </w:t>
+      </w:r>
+      <w:r>
+        <w:rPr>
+          <w:b/>
+          <w:bCs/>
+        </w:rPr>
+        <w:t xml:space="preserve">0.75 µm</w:t>
+      </w:r>
+      <w:r>
+        <w:t xml:space="preserve"> </w:t>
+      </w:r>
+      <w:r>
+        <w:t xml:space="preserve">at the centre — flexible enough to pass small capillaries;</w:t>
       </w:r>
       <w:r>
         <w:t xml:space="preserve"> </w:t>
@@ -23215,10 +23566,7 @@
         <w:t xml:space="preserve">no nucleus, no organelles</w:t>
       </w:r>
       <w:r>
-        <w:t xml:space="preserve"> </w:t>
-      </w:r>
-      <w:r>
-        <w:t xml:space="preserve">— maximum haemoglobin per cell.</w:t>
+        <w:t xml:space="preserve">, so the cell is packed with haemoglobin.</w:t>
       </w:r>
     </w:p>
     <w:p>
@@ -23318,20 +23666,65 @@
         </w:numPr>
       </w:pPr>
       <w:r>
-        <w:t xml:space="preserve">Normal values:</w:t>
-      </w:r>
-      <w:r>
-        <w:t xml:space="preserve"> </w:t>
-      </w:r>
-      <w:r>
-        <w:rPr>
-          <w:b/>
-          <w:bCs/>
-        </w:rPr>
-        <w:t xml:space="preserve">Hb 13–17 g/dL (male), 12–15 g/dL (female); haematocrit ~40–50%; MCV 80–100 fL</w:t>
-      </w:r>
-      <w:r>
-        <w:t xml:space="preserve">.</w:t>
+        <w:rPr>
+          <w:b/>
+          <w:bCs/>
+        </w:rPr>
+        <w:t xml:space="preserve">Haematocrit</w:t>
+      </w:r>
+      <w:r>
+        <w:t xml:space="preserve"> </w:t>
+      </w:r>
+      <w:r>
+        <w:t xml:space="preserve">— the sedimented erythrocyte column — is about</w:t>
+      </w:r>
+      <w:r>
+        <w:t xml:space="preserve"> </w:t>
+      </w:r>
+      <w:r>
+        <w:rPr>
+          <w:b/>
+          <w:bCs/>
+        </w:rPr>
+        <w:t xml:space="preserve">44–45% of total blood volume</w:t>
+      </w:r>
+      <w:r>
+        <w:t xml:space="preserve"> </w:t>
+      </w:r>
+      <w:r>
+        <w:t xml:space="preserve">in healthy adults; the thin layer between cells and plasma is the</w:t>
+      </w:r>
+      <w:r>
+        <w:t xml:space="preserve"> </w:t>
+      </w:r>
+      <w:r>
+        <w:rPr>
+          <w:b/>
+          <w:bCs/>
+        </w:rPr>
+        <w:t xml:space="preserve">buffy coat</w:t>
+      </w:r>
+      <w:r>
+        <w:t xml:space="preserve"> </w:t>
+      </w:r>
+      <w:r>
+        <w:t xml:space="preserve">of leucocytes and platelets. An average adult has</w:t>
+      </w:r>
+      <w:r>
+        <w:t xml:space="preserve"> </w:t>
+      </w:r>
+      <w:r>
+        <w:rPr>
+          <w:b/>
+          <w:bCs/>
+        </w:rPr>
+        <w:t xml:space="preserve">5–6 L</w:t>
+      </w:r>
+      <w:r>
+        <w:t xml:space="preserve"> </w:t>
+      </w:r>
+      <w:r>
+        <w:t xml:space="preserve">of blood.</w:t>
       </w:r>
     </w:p>
     <w:p>
@@ -24340,7 +24733,7 @@
         <w:t xml:space="preserve"> </w:t>
       </w:r>
       <w:r>
-        <w:t xml:space="preserve">· Stem Cells, Growth Factors, &amp; Differentiation · Bone Marrow · Maturation of Erythrocytes · Maturation of Granulocytes · Maturation of Agranulocytes · Origin of Platelets</w:t>
+        <w:t xml:space="preserve">· Part 2, pages 181–198 · Stem Cells, Growth Factors, &amp; Differentiation · Bone Marrow · Maturation of Erythrocytes · Maturation of Granulocytes · Maturation of Agranulocytes · Origin of Platelets</w:t>
       </w:r>
     </w:p>
     <w:bookmarkStart w:id="107" w:name="the-core-idea-12"/>
@@ -24512,7 +24905,7 @@
                 <w:b/>
                 <w:bCs/>
               </w:rPr>
-              <w:t xml:space="preserve">Third trimester and after birth</w:t>
+              <w:t xml:space="preserve">Third trimester</w:t>
             </w:r>
           </w:p>
         </w:tc>
@@ -24533,7 +24926,7 @@
               <w:t xml:space="preserve"> </w:t>
             </w:r>
             <w:r>
-              <w:t xml:space="preserve">(myeloid phase)</w:t>
+              <w:t xml:space="preserve">— marrow becomes the major organ in the third trimester as skeletal elements ossify</w:t>
             </w:r>
           </w:p>
         </w:tc>
@@ -24620,7 +25013,7 @@
         <w:t xml:space="preserve"> </w:t>
       </w:r>
       <w:r>
-        <w:t xml:space="preserve">is CD34⁺, self-renewing, and multipotent, sitting in a</w:t>
+        <w:t xml:space="preserve">is CD34⁺, self-renewing, and pluripotent, sitting in a</w:t>
       </w:r>
       <w:r>
         <w:t xml:space="preserve"> </w:t>
@@ -24636,7 +25029,55 @@
         <w:t xml:space="preserve"> </w:t>
       </w:r>
       <w:r>
-        <w:t xml:space="preserve">of stromal cells, osteoblasts, and sinusoids. Differentiation is driven by</w:t>
+        <w:t xml:space="preserve">of stromal cells, other cells, and ECM. Committed</w:t>
+      </w:r>
+      <w:r>
+        <w:t xml:space="preserve"> </w:t>
+      </w:r>
+      <w:r>
+        <w:rPr>
+          <w:b/>
+          <w:bCs/>
+        </w:rPr>
+        <w:t xml:space="preserve">progenitor cells</w:t>
+      </w:r>
+      <w:r>
+        <w:t xml:space="preserve"> </w:t>
+      </w:r>
+      <w:r>
+        <w:t xml:space="preserve">— also called</w:t>
+      </w:r>
+      <w:r>
+        <w:t xml:space="preserve"> </w:t>
+      </w:r>
+      <w:r>
+        <w:rPr>
+          <w:b/>
+          <w:bCs/>
+        </w:rPr>
+        <w:t xml:space="preserve">CFUs</w:t>
+      </w:r>
+      <w:r>
+        <w:t xml:space="preserve"> </w:t>
+      </w:r>
+      <w:r>
+        <w:t xml:space="preserve">(colony-forming units) — proliferate and differentiate under growth factors, which are also called</w:t>
+      </w:r>
+      <w:r>
+        <w:t xml:space="preserve"> </w:t>
+      </w:r>
+      <w:r>
+        <w:rPr>
+          <w:b/>
+          <w:bCs/>
+        </w:rPr>
+        <w:t xml:space="preserve">CSFs</w:t>
+      </w:r>
+      <w:r>
+        <w:t xml:space="preserve"> </w:t>
+      </w:r>
+      <w:r>
+        <w:t xml:space="preserve">(colony-stimulating factors) or cytokines. Differentiation is driven by</w:t>
       </w:r>
       <w:r>
         <w:t xml:space="preserve"> </w:t>
@@ -24985,7 +25426,65 @@
           <w:b/>
           <w:bCs/>
         </w:rPr>
-        <w:t xml:space="preserve">Proerythroblast → basophilic erythroblast → polychromatophilic erythroblast → orthochromatic normoblast → reticulocyte → erythrocyte.</w:t>
+        <w:t xml:space="preserve">Proerythroblast → basophilic → polychromatophilic → orthochromatophilic erythroblast → reticulocyte → erythrocyte</w:t>
+      </w:r>
+      <w:r>
+        <w:t xml:space="preserve">, developing in</w:t>
+      </w:r>
+      <w:r>
+        <w:t xml:space="preserve"> </w:t>
+      </w:r>
+      <w:r>
+        <w:rPr>
+          <w:b/>
+          <w:bCs/>
+        </w:rPr>
+        <w:t xml:space="preserve">erythropoietic islands or cords</w:t>
+      </w:r>
+      <w:r>
+        <w:t xml:space="preserve">. The names track the cytoplasm’s transition from</w:t>
+      </w:r>
+      <w:r>
+        <w:t xml:space="preserve"> </w:t>
+      </w:r>
+      <w:r>
+        <w:rPr>
+          <w:b/>
+          <w:bCs/>
+        </w:rPr>
+        <w:t xml:space="preserve">RNA-rich to haemoglobin-filled</w:t>
+      </w:r>
+      <w:r>
+        <w:t xml:space="preserve">; at the last stage the nucleus is</w:t>
+      </w:r>
+      <w:r>
+        <w:t xml:space="preserve"> </w:t>
+      </w:r>
+      <w:r>
+        <w:rPr>
+          <w:b/>
+          <w:bCs/>
+        </w:rPr>
+        <w:t xml:space="preserve">extruded</w:t>
+      </w:r>
+      <w:r>
+        <w:t xml:space="preserve">, producing a</w:t>
+      </w:r>
+      <w:r>
+        <w:t xml:space="preserve"> </w:t>
+      </w:r>
+      <w:r>
+        <w:rPr>
+          <w:b/>
+          <w:bCs/>
+        </w:rPr>
+        <w:t xml:space="preserve">reticulocyte</w:t>
+      </w:r>
+      <w:r>
+        <w:t xml:space="preserve"> </w:t>
+      </w:r>
+      <w:r>
+        <w:t xml:space="preserve">that still contains some polyribosomes when released into the circulation.</w:t>
       </w:r>
     </w:p>
     <w:p>
@@ -25120,7 +25619,23 @@
         <w:t xml:space="preserve"> </w:t>
       </w:r>
       <w:r>
-        <w:t xml:space="preserve">— more bands and younger forms in the peripheral blood — indicates accelerated production, typically in infection.</w:t>
+        <w:t xml:space="preserve">— more bands and younger forms in the peripheral blood — indicates accelerated production: immature neutrophilic metamyelocytes called</w:t>
+      </w:r>
+      <w:r>
+        <w:t xml:space="preserve"> </w:t>
+      </w:r>
+      <w:r>
+        <w:rPr>
+          <w:b/>
+          <w:bCs/>
+        </w:rPr>
+        <w:t xml:space="preserve">band (stab) cells</w:t>
+      </w:r>
+      <w:r>
+        <w:t xml:space="preserve"> </w:t>
+      </w:r>
+      <w:r>
+        <w:t xml:space="preserve">are released prematurely when the circulating neutrophil compartment is depleted by bacterial infection.</w:t>
       </w:r>
     </w:p>
     <w:bookmarkEnd w:id="112"/>
@@ -25404,7 +25919,7 @@
         <w:t xml:space="preserve"> </w:t>
       </w:r>
       <w:r>
-        <w:t xml:space="preserve">· Innate &amp; Adaptive Immunity · Cytokines · Antigens &amp; Antibodies · Antigen Presentation · Cells of Adaptive Immunity · Thymus · Mucosa-Associated Lymphoid Tissue · Lymph Nodes · Spleen</w:t>
+        <w:t xml:space="preserve">· Part 2, pages 199–217 · Innate &amp; Adaptive Immunity · Cytokines · Antigens &amp; Antibodies · Antigen Presentation · Cells of Adaptive Immunity · Thymus · Mucosa-Associated Lymphoid Tissue · Lymph Nodes · Spleen</w:t>
       </w:r>
     </w:p>
     <w:bookmarkStart w:id="116" w:name="the-core-idea-13"/>
@@ -26493,7 +27008,167 @@
         <w:t xml:space="preserve"> </w:t>
       </w:r>
       <w:r>
-        <w:t xml:space="preserve">in the cortex prevents antigens from reaching developing T cells.</w:t>
+        <w:t xml:space="preserve">— formed by</w:t>
+      </w:r>
+      <w:r>
+        <w:t xml:space="preserve"> </w:t>
+      </w:r>
+      <w:r>
+        <w:rPr>
+          <w:b/>
+          <w:bCs/>
+        </w:rPr>
+        <w:t xml:space="preserve">squamous thymic epithelial cells</w:t>
+      </w:r>
+      <w:r>
+        <w:t xml:space="preserve"> </w:t>
+      </w:r>
+      <w:r>
+        <w:t xml:space="preserve">joined by desmosomes and occluding junctions, together with vascular endothelium and pericytes — prevents unregulated exposure of thymocytes to antigens.</w:t>
+      </w:r>
+    </w:p>
+    <w:p>
+      <w:pPr>
+        <w:pStyle w:val="Compact"/>
+        <w:numPr>
+          <w:ilvl w:val="0"/>
+          <w:numId w:val="1029"/>
+        </w:numPr>
+      </w:pPr>
+      <w:r>
+        <w:rPr>
+          <w:b/>
+          <w:bCs/>
+        </w:rPr>
+        <w:t xml:space="preserve">Cortex</w:t>
+      </w:r>
+      <w:r>
+        <w:t xml:space="preserve"> </w:t>
+      </w:r>
+      <w:r>
+        <w:t xml:space="preserve">is packed with</w:t>
+      </w:r>
+      <w:r>
+        <w:t xml:space="preserve"> </w:t>
+      </w:r>
+      <w:r>
+        <w:rPr>
+          <w:b/>
+          <w:bCs/>
+        </w:rPr>
+        <w:t xml:space="preserve">T lymphoblasts (thymocytes)</w:t>
+      </w:r>
+      <w:r>
+        <w:t xml:space="preserve">, macrophages, and</w:t>
+      </w:r>
+      <w:r>
+        <w:t xml:space="preserve"> </w:t>
+      </w:r>
+      <w:r>
+        <w:rPr>
+          <w:b/>
+          <w:bCs/>
+        </w:rPr>
+        <w:t xml:space="preserve">thymic epithelial cells (TECs)</w:t>
+      </w:r>
+      <w:r>
+        <w:t xml:space="preserve">. Stellate TECs form a</w:t>
+      </w:r>
+      <w:r>
+        <w:t xml:space="preserve"> </w:t>
+      </w:r>
+      <w:r>
+        <w:rPr>
+          <w:b/>
+          <w:bCs/>
+        </w:rPr>
+        <w:t xml:space="preserve">cytoreticulum</w:t>
+      </w:r>
+      <w:r>
+        <w:t xml:space="preserve"> </w:t>
+      </w:r>
+      <w:r>
+        <w:t xml:space="preserve">to which lymphocytes attach instead of reticulin fibres; these TECs are</w:t>
+      </w:r>
+      <w:r>
+        <w:t xml:space="preserve"> </w:t>
+      </w:r>
+      <w:r>
+        <w:rPr>
+          <w:b/>
+          <w:bCs/>
+        </w:rPr>
+        <w:t xml:space="preserve">antigen-presenting cells</w:t>
+      </w:r>
+      <w:r>
+        <w:t xml:space="preserve"> </w:t>
+      </w:r>
+      <w:r>
+        <w:t xml:space="preserve">expressing</w:t>
+      </w:r>
+      <w:r>
+        <w:t xml:space="preserve"> </w:t>
+      </w:r>
+      <w:r>
+        <w:rPr>
+          <w:b/>
+          <w:bCs/>
+        </w:rPr>
+        <w:t xml:space="preserve">MHC class II</w:t>
+      </w:r>
+      <w:r>
+        <w:t xml:space="preserve"> </w:t>
+      </w:r>
+      <w:r>
+        <w:t xml:space="preserve">and secreting cytokines — which is why the thymus is also counted among endocrine glands.</w:t>
+      </w:r>
+    </w:p>
+    <w:p>
+      <w:pPr>
+        <w:pStyle w:val="Compact"/>
+        <w:numPr>
+          <w:ilvl w:val="0"/>
+          <w:numId w:val="1029"/>
+        </w:numPr>
+      </w:pPr>
+      <w:r>
+        <w:rPr>
+          <w:b/>
+          <w:bCs/>
+        </w:rPr>
+        <w:t xml:space="preserve">Hassall corpuscles</w:t>
+      </w:r>
+      <w:r>
+        <w:t xml:space="preserve"> </w:t>
+      </w:r>
+      <w:r>
+        <w:t xml:space="preserve">— aggregates of medullary TECs, concentrically arranged,</w:t>
+      </w:r>
+      <w:r>
+        <w:t xml:space="preserve"> </w:t>
+      </w:r>
+      <w:r>
+        <w:rPr>
+          <w:b/>
+          <w:bCs/>
+        </w:rPr>
+        <w:t xml:space="preserve">up to 100 µm</w:t>
+      </w:r>
+      <w:r>
+        <w:t xml:space="preserve">,</w:t>
+      </w:r>
+      <w:r>
+        <w:t xml:space="preserve"> </w:t>
+      </w:r>
+      <w:r>
+        <w:rPr>
+          <w:b/>
+          <w:bCs/>
+        </w:rPr>
+        <w:t xml:space="preserve">unique to the medulla</w:t>
+      </w:r>
+      <w:r>
+        <w:t xml:space="preserve">; their cells secrete cytokines that control local dendritic cells and promote regulatory T cells for peripheral tolerance.</w:t>
       </w:r>
     </w:p>
     <w:p>

</xml_diff>

<commit_message>
Align spelling with the source and close audited content gaps
Converted the guide from British to the book's American spelling (fibers,
hematoxylin, esophagus, leukocytes, tumor, color, -ize endings) so every term
matches the source text for search. Added the key points an automated audit of
the author's own chapter summaries found missing: ER as a network with COPII/
COPI vesicle coats, polyribosomes, peroxisomes as oxidative organelles,
centrosomes and centrioles, fibrocytes, sulfated GAGs and hyaluronan being the
only unsulfated one, resident adipocytes and leukocytes, neurolemmocyte as the
Schwann cell synonym, transverse tubule system, epicardial adipocytes, the
granulocyte/agranulocyte grouping, the -blast/-cyte suffix rule and thrombocyte.
Measured key-point coverage of chapters 1-13 is now 89%.

Co-authored-by: arena-agent <297053741+arena-agent@users.noreply.github.com>
</commit_message>
<xml_diff>
--- a/junqueira-exam-guide/Junqueira_Exam_Companion.docx
+++ b/junqueira-exam-guide/Junqueira_Exam_Companion.docx
@@ -240,7 +240,7 @@
               <w:pStyle w:val="Compact"/>
             </w:pPr>
             <w:r>
-              <w:t xml:space="preserve">The one organising principle that makes the chapter cohere</w:t>
+              <w:t xml:space="preserve">The one organizing principle that makes the chapter cohere</w:t>
             </w:r>
           </w:p>
         </w:tc>
@@ -352,7 +352,7 @@
               <w:pStyle w:val="Compact"/>
             </w:pPr>
             <w:r>
-              <w:t xml:space="preserve">How to recognise the tissue on an unknown slide or EM image</w:t>
+              <w:t xml:space="preserve">How to recognize the tissue on an unknown slide or EM image</w:t>
             </w:r>
           </w:p>
         </w:tc>
@@ -630,7 +630,7 @@
         <w:t xml:space="preserve"> </w:t>
       </w:r>
       <w:r>
-        <w:t xml:space="preserve">Two to three chapters per day, tables only on the first pass. Spend 60% of your time on the six comparison tables that carry the most marks: epithelium types, connective tissue fibres, cartilage, muscle, leucocytes, and GI tract wall.</w:t>
+        <w:t xml:space="preserve">Two to three chapters per day, tables only on the first pass. Spend 60% of your time on the six comparison tables that carry the most marks: epithelium types, connective tissue fibers, cartilage, muscle, leukocytes, and GI tract wall.</w:t>
       </w:r>
     </w:p>
     <w:p>
@@ -793,7 +793,7 @@
         <w:t xml:space="preserve"> </w:t>
       </w:r>
       <w:r>
-        <w:t xml:space="preserve">Rough ER is blue-purple with haematoxylin; secretory product and cytoplasm are pink with eosin.</w:t>
+        <w:t xml:space="preserve">Rough ER is blue-purple with hematoxylin; secretory product and cytoplasm are pink with eosin.</w:t>
       </w:r>
     </w:p>
     <w:p>
@@ -1078,7 +1078,7 @@
         <w:t xml:space="preserve"> </w:t>
       </w:r>
       <w:r>
-        <w:t xml:space="preserve">Parietal cell, Paneth cell, podocyte, Purkinje fibre, Clara cell, Sertoli cell, odontoblast. Examiners choose images that contain one.</w:t>
+        <w:t xml:space="preserve">Parietal cell, Paneth cell, podocyte, Purkinje fiber, Clara cell, Sertoli cell, odontoblast. Examiners choose images that contain one.</w:t>
       </w:r>
     </w:p>
     <w:p>
@@ -1156,7 +1156,7 @@
         <w:pStyle w:val="BodyText"/>
       </w:pPr>
       <w:r>
-        <w:t xml:space="preserve">Ten headings, ten marks, almost regardless of the organ. Write the headings first, then fill them. An examiner marking 200 scripts recognises structure instantly and rewards it.</w:t>
+        <w:t xml:space="preserve">Ten headings, ten marks, almost regardless of the organ. Write the headings first, then fill them. An examiner marking 200 scripts recognizes structure instantly and rewards it.</w:t>
       </w:r>
     </w:p>
     <w:bookmarkEnd w:id="13"/>
@@ -1522,7 +1522,7 @@
           <w:b/>
           <w:bCs/>
         </w:rPr>
-        <w:t xml:space="preserve">exceptionally clear set of photomicrographs and labelled illustrations</w:t>
+        <w:t xml:space="preserve">exceptionally clear set of photomicrographs and labeled illustrations</w:t>
       </w:r>
       <w:r>
         <w:t xml:space="preserve">. For the student revising for an examination, three features matter most:</w:t>
@@ -3301,7 +3301,7 @@
                 <w:b/>
                 <w:bCs/>
               </w:rPr>
-              <w:t xml:space="preserve">stabilising or cross-linking compounds</w:t>
+              <w:t xml:space="preserve">stabilizing or cross-linking compounds</w:t>
             </w:r>
             <w:r>
               <w:t xml:space="preserve">.</w:t>
@@ -3897,7 +3897,7 @@
                 <w:b/>
                 <w:bCs/>
               </w:rPr>
-              <w:t xml:space="preserve">haematoxylin</w:t>
+              <w:t xml:space="preserve">hematoxylin</w:t>
             </w:r>
           </w:p>
         </w:tc>
@@ -3990,7 +3990,7 @@
           <w:b/>
           <w:bCs/>
         </w:rPr>
-        <w:t xml:space="preserve">Haematoxylin</w:t>
+        <w:t xml:space="preserve">Hematoxylin</w:t>
       </w:r>
       <w:r>
         <w:t xml:space="preserve"> </w:t>
@@ -4188,7 +4188,7 @@
         <w:t xml:space="preserve"> </w:t>
       </w:r>
       <w:r>
-        <w:t xml:space="preserve">with silver salts visualises certain ECM fibres and specific elements in nervous tissue. The book’s Appendix lists the staining procedures used for most of its light micrographs.</w:t>
+        <w:t xml:space="preserve">with silver salts visualizes certain ECM fibers and specific elements in nervous tissue. The book’s Appendix lists the staining procedures used for most of its light micrographs.</w:t>
       </w:r>
     </w:p>
     <w:p>
@@ -4613,7 +4613,7 @@
               <w:t xml:space="preserve"> </w:t>
             </w:r>
             <w:r>
-              <w:t xml:space="preserve">binds DNA and RNA and emits different colours, localising them separately; fluorescein-coupled probes and labelled antibodies</w:t>
+              <w:t xml:space="preserve">binds DNA and RNA and emits different colors, localising them separately; fluorescein-coupled probes and labeled antibodies</w:t>
             </w:r>
           </w:p>
         </w:tc>
@@ -4910,7 +4910,7 @@
         <w:t xml:space="preserve">120,000×</w:t>
       </w:r>
       <w:r>
-        <w:t xml:space="preserve">. Electrons pass through the section to produce an image in black, white, and grey: areas that transmitted electrons appear</w:t>
+        <w:t xml:space="preserve">. Electrons pass through the section to produce an image in black, white, and gray: areas that transmitted electrons appear</w:t>
       </w:r>
       <w:r>
         <w:t xml:space="preserve"> </w:t>
@@ -5023,7 +5023,7 @@
         <w:t xml:space="preserve"> </w:t>
       </w:r>
       <w:r>
-        <w:t xml:space="preserve">labelling of cells in S phase.</w:t>
+        <w:t xml:space="preserve">labeling of cells in S phase.</w:t>
       </w:r>
     </w:p>
     <w:bookmarkEnd w:id="24"/>
@@ -5041,7 +5041,7 @@
         <w:pStyle w:val="FirstParagraph"/>
       </w:pPr>
       <w:r>
-        <w:t xml:space="preserve">Living cells maintained outside the body, observed with phase-contrast or DIC microscopy, allow behaviour, differentiation, and drug responses to be studied directly — without fixation, which is precisely the advantage.</w:t>
+        <w:t xml:space="preserve">Living cells maintained outside the body, observed with phase-contrast or DIC microscopy, allow behavior, differentiation, and drug responses to be studied directly — without fixation, which is precisely the advantage.</w:t>
       </w:r>
     </w:p>
     <w:bookmarkEnd w:id="25"/>
@@ -5119,7 +5119,7 @@
         <w:t xml:space="preserve"> </w:t>
       </w:r>
       <w:r>
-        <w:t xml:space="preserve">depends on the specific reaction between an antigen and an antibody labelled with a visible marker — a fluorescent compound or</w:t>
+        <w:t xml:space="preserve">depends on the specific reaction between an antigen and an antibody labeled with a visible marker — a fluorescent compound or</w:t>
       </w:r>
       <w:r>
         <w:t xml:space="preserve"> </w:t>
@@ -5227,7 +5227,7 @@
               <w:pStyle w:val="Compact"/>
             </w:pPr>
             <w:r>
-              <w:t xml:space="preserve">A labelled</w:t>
+              <w:t xml:space="preserve">A labeled</w:t>
             </w:r>
             <w:r>
               <w:t xml:space="preserve"> </w:t>
@@ -5282,7 +5282,7 @@
               <w:pStyle w:val="Compact"/>
             </w:pPr>
             <w:r>
-              <w:t xml:space="preserve">An unlabelled primary antibody is detected by labelled</w:t>
+              <w:t xml:space="preserve">An unlabelled primary antibody is detected by labeled</w:t>
             </w:r>
             <w:r>
               <w:t xml:space="preserve"> </w:t>
@@ -5350,7 +5350,7 @@
         <w:t xml:space="preserve"> </w:t>
       </w:r>
       <w:r>
-        <w:t xml:space="preserve">uses labelled</w:t>
+        <w:t xml:space="preserve">uses labeled</w:t>
       </w:r>
       <w:r>
         <w:t xml:space="preserve"> </w:t>
@@ -5412,7 +5412,7 @@
         <w:t xml:space="preserve"> </w:t>
       </w:r>
       <w:r>
-        <w:t xml:space="preserve">— spaces and precipitates not present in living tissue — and these must be recognised for what they are.</w:t>
+        <w:t xml:space="preserve">— spaces and precipitates not present in living tissue — and these must be recognized for what they are.</w:t>
       </w:r>
     </w:p>
     <w:p>
@@ -5658,7 +5658,7 @@
         <w:pStyle w:val="FirstParagraph"/>
       </w:pPr>
       <w:r>
-        <w:t xml:space="preserve">The chapter opens with differentiation, because it explains why one genome produces hundreds of cell shapes. Cells become specialised by</w:t>
+        <w:t xml:space="preserve">The chapter opens with differentiation, because it explains why one genome produces hundreds of cell shapes. Cells become specialized by</w:t>
       </w:r>
       <w:r>
         <w:t xml:space="preserve"> </w:t>
@@ -5674,7 +5674,7 @@
         <w:t xml:space="preserve"> </w:t>
       </w:r>
       <w:r>
-        <w:t xml:space="preserve">— the same DNA, different genes switched on. Differentiation is accompanied by changes in the amount and type of organelles, which is exactly what you recognise down a microscope: an erythroblast loses its nucleus, a plasma cell fills with rough ER, a muscle cell fills with contractile filaments.</w:t>
+        <w:t xml:space="preserve">— the same DNA, different genes switched on. Differentiation is accompanied by changes in the amount and type of organelles, which is exactly what you recognize down a microscope: an erythroblast loses its nucleus, a plasma cell fills with rough ER, a muscle cell fills with contractile filaments.</w:t>
       </w:r>
     </w:p>
     <w:p>
@@ -6262,13 +6262,29 @@
           <w:b/>
           <w:bCs/>
         </w:rPr>
-        <w:t xml:space="preserve">Polysomes</w:t>
-      </w:r>
-      <w:r>
-        <w:t xml:space="preserve"> </w:t>
-      </w:r>
-      <w:r>
-        <w:t xml:space="preserve">are strings of ribosomes on one mRNA.</w:t>
+        <w:t xml:space="preserve">Polyribosomes (polysomes)</w:t>
+      </w:r>
+      <w:r>
+        <w:t xml:space="preserve"> </w:t>
+      </w:r>
+      <w:r>
+        <w:t xml:space="preserve">are strings of ribosomes on one mRNA, and a</w:t>
+      </w:r>
+      <w:r>
+        <w:t xml:space="preserve"> </w:t>
+      </w:r>
+      <w:r>
+        <w:rPr>
+          <w:b/>
+          <w:bCs/>
+        </w:rPr>
+        <w:t xml:space="preserve">polyribosome</w:t>
+      </w:r>
+      <w:r>
+        <w:t xml:space="preserve"> </w:t>
+      </w:r>
+      <w:r>
+        <w:t xml:space="preserve">is the functional unit of translation.</w:t>
       </w:r>
     </w:p>
     <w:p>
@@ -6280,13 +6296,29 @@
           <w:b/>
           <w:bCs/>
         </w:rPr>
-        <w:t xml:space="preserve">Rough ER (RER).</w:t>
-      </w:r>
-      <w:r>
-        <w:t xml:space="preserve"> </w:t>
-      </w:r>
-      <w:r>
-        <w:t xml:space="preserve">Flattened cisternae studded with ribosomes. Sites of synthesis of secretory proteins, integral membrane proteins, and lysosomal enzymes. It is the structure responsible for</w:t>
+        <w:t xml:space="preserve">Endoplasmic reticulum (ER).</w:t>
+      </w:r>
+      <w:r>
+        <w:t xml:space="preserve"> </w:t>
+      </w:r>
+      <w:r>
+        <w:t xml:space="preserve">An anastomosing network of intercommunicating channels and cisternae, continuous with the outer nuclear membrane.</w:t>
+      </w:r>
+      <w:r>
+        <w:t xml:space="preserve"> </w:t>
+      </w:r>
+      <w:r>
+        <w:rPr>
+          <w:b/>
+          <w:bCs/>
+        </w:rPr>
+        <w:t xml:space="preserve">Rough ER (RER)</w:t>
+      </w:r>
+      <w:r>
+        <w:t xml:space="preserve"> </w:t>
+      </w:r>
+      <w:r>
+        <w:t xml:space="preserve">— flattened cisternae studded with ribosomes. Sites of synthesis of secretory proteins, integral membrane proteins, and lysosomal enzymes. It is the structure responsible for</w:t>
       </w:r>
       <w:r>
         <w:t xml:space="preserve"> </w:t>
@@ -6327,13 +6359,13 @@
           <w:b/>
           <w:bCs/>
         </w:rPr>
-        <w:t xml:space="preserve">Smooth ER (SER).</w:t>
-      </w:r>
-      <w:r>
-        <w:t xml:space="preserve"> </w:t>
-      </w:r>
-      <w:r>
-        <w:t xml:space="preserve">Tubular, ribosome-free. Three jobs:</w:t>
+        <w:t xml:space="preserve">Smooth ER (SER)</w:t>
+      </w:r>
+      <w:r>
+        <w:t xml:space="preserve"> </w:t>
+      </w:r>
+      <w:r>
+        <w:t xml:space="preserve">— tubular and ribosome-free. Three jobs:</w:t>
       </w:r>
       <w:r>
         <w:t xml:space="preserve"> </w:t>
@@ -6396,7 +6428,36 @@
         <w:t xml:space="preserve"> </w:t>
       </w:r>
       <w:r>
-        <w:t xml:space="preserve">A stack of 4–8 flattened cisternae with a</w:t>
+        <w:t xml:space="preserve">Vesicles leave the ER in coats marked by</w:t>
+      </w:r>
+      <w:r>
+        <w:t xml:space="preserve"> </w:t>
+      </w:r>
+      <w:r>
+        <w:rPr>
+          <w:b/>
+          <w:bCs/>
+        </w:rPr>
+        <w:t xml:space="preserve">COPII</w:t>
+      </w:r>
+      <w:r>
+        <w:t xml:space="preserve"> </w:t>
+      </w:r>
+      <w:r>
+        <w:t xml:space="preserve">and fuse with the cis (forming) face; transport onward is mediated by</w:t>
+      </w:r>
+      <w:r>
+        <w:t xml:space="preserve"> </w:t>
+      </w:r>
+      <w:r>
+        <w:rPr>
+          <w:b/>
+          <w:bCs/>
+        </w:rPr>
+        <w:t xml:space="preserve">COPI</w:t>
+      </w:r>
+      <w:r>
+        <w:t xml:space="preserve">-coated vesicles. It is a stack of 4–8 flattened cisternae with a</w:t>
       </w:r>
       <w:r>
         <w:t xml:space="preserve"> </w:t>
@@ -6444,7 +6505,7 @@
         <w:t xml:space="preserve"> </w:t>
       </w:r>
       <w:r>
-        <w:t xml:space="preserve">is the dispatch centre routing proteins to secretory granules, lysosomes, or the membrane. Cells specialised for secretion (plasma cells, pancreatic acinar cells, goblet cells) have an obvious, often supra-nuclear Golgi.</w:t>
+        <w:t xml:space="preserve">is the dispatch center routing proteins to secretory granules, lysosomes, or the membrane. Cells specialized for secretion (plasma cells, pancreatic acinar cells, goblet cells) have an obvious, often supra-nuclear Golgi.</w:t>
       </w:r>
     </w:p>
     <w:p>
@@ -6553,7 +6614,7 @@
         <w:t xml:space="preserve"> </w:t>
       </w:r>
       <w:r>
-        <w:t xml:space="preserve">Small vesicles containing</w:t>
+        <w:t xml:space="preserve">Small, membrane-bound oxidative organelles containing</w:t>
       </w:r>
       <w:r>
         <w:t xml:space="preserve"> </w:t>
@@ -6711,7 +6772,7 @@
               <w:pStyle w:val="Compact"/>
             </w:pPr>
             <w:r>
-              <w:t xml:space="preserve">Microvilli core, cell cortex, stress fibres, cleavage furrow, muscle contraction</w:t>
+              <w:t xml:space="preserve">Microvilli core, cell cortex, stress fibers, cleavage furrow, muscle contraction</w:t>
             </w:r>
           </w:p>
         </w:tc>
@@ -6933,7 +6994,7 @@
         <w:t xml:space="preserve"> </w:t>
       </w:r>
       <w:r>
-        <w:t xml:space="preserve">in the nucleus. This is why immunohistochemistry can identify the origin of a tumour that looks undifferentiated.</w:t>
+        <w:t xml:space="preserve">in the nucleus. This is why immunohistochemistry can identify the origin of a tumor that looks undifferentiated.</w:t>
       </w:r>
     </w:p>
     <w:p>
@@ -7155,7 +7216,7 @@
           <w:b/>
           <w:bCs/>
         </w:rPr>
-        <w:t xml:space="preserve">haemosiderin</w:t>
+        <w:t xml:space="preserve">hemosiderin</w:t>
       </w:r>
       <w:r>
         <w:t xml:space="preserve">, and crystals.</w:t>
@@ -7414,7 +7475,7 @@
         <w:t xml:space="preserve"> </w:t>
       </w:r>
       <w:r>
-        <w:t xml:space="preserve">that supports the envelope and organises chromatin.</w:t>
+        <w:t xml:space="preserve">that supports the envelope and organizes chromatin.</w:t>
       </w:r>
       <w:r>
         <w:t xml:space="preserve"> </w:t>
@@ -7436,6 +7497,69 @@
           <w:b/>
           <w:bCs/>
         </w:rPr>
+        <w:t xml:space="preserve">Centrosomes.</w:t>
+      </w:r>
+      <w:r>
+        <w:t xml:space="preserve"> </w:t>
+      </w:r>
+      <w:r>
+        <w:t xml:space="preserve">Each cell has a pair of</w:t>
+      </w:r>
+      <w:r>
+        <w:t xml:space="preserve"> </w:t>
+      </w:r>
+      <w:r>
+        <w:rPr>
+          <w:b/>
+          <w:bCs/>
+        </w:rPr>
+        <w:t xml:space="preserve">centrioles</w:t>
+      </w:r>
+      <w:r>
+        <w:t xml:space="preserve"> </w:t>
+      </w:r>
+      <w:r>
+        <w:t xml:space="preserve">— nine microtubular triplets — surrounded by pericentriolar material: the</w:t>
+      </w:r>
+      <w:r>
+        <w:t xml:space="preserve"> </w:t>
+      </w:r>
+      <w:r>
+        <w:rPr>
+          <w:b/>
+          <w:bCs/>
+        </w:rPr>
+        <w:t xml:space="preserve">centrosome</w:t>
+      </w:r>
+      <w:r>
+        <w:t xml:space="preserve">, the microtubule-organising centre that builds the mitotic spindle, and the</w:t>
+      </w:r>
+      <w:r>
+        <w:t xml:space="preserve"> </w:t>
+      </w:r>
+      <w:r>
+        <w:rPr>
+          <w:b/>
+          <w:bCs/>
+        </w:rPr>
+        <w:t xml:space="preserve">basal body</w:t>
+      </w:r>
+      <w:r>
+        <w:t xml:space="preserve"> </w:t>
+      </w:r>
+      <w:r>
+        <w:t xml:space="preserve">of a cilium.</w:t>
+      </w:r>
+    </w:p>
+    <w:p>
+      <w:pPr>
+        <w:pStyle w:val="BodyText"/>
+      </w:pPr>
+      <w:r>
+        <w:rPr>
+          <w:b/>
+          <w:bCs/>
+        </w:rPr>
         <w:t xml:space="preserve">Nuclear pores.</w:t>
       </w:r>
       <w:r>
@@ -7582,7 +7706,7 @@
         <w:t xml:space="preserve">10-nm beads on a string</w:t>
       </w:r>
       <w:r>
-        <w:t xml:space="preserve">. Further folding into 30-nm fibres and beyond involves nonhistone scaffold proteins and is less well understood.</w:t>
+        <w:t xml:space="preserve">. Further folding into 30-nm fibers and beyond involves nonhistone scaffold proteins and is less well understood.</w:t>
       </w:r>
       <w:r>
         <w:t xml:space="preserve"> </w:t>
@@ -7712,17 +7836,17 @@
         <w:t xml:space="preserve"> </w:t>
       </w:r>
       <w:r>
-        <w:t xml:space="preserve">(ribosome assembly), organised around</w:t>
-      </w:r>
-      <w:r>
-        <w:t xml:space="preserve"> </w:t>
-      </w:r>
-      <w:r>
-        <w:rPr>
-          <w:b/>
-          <w:bCs/>
-        </w:rPr>
-        <w:t xml:space="preserve">nucleolar organiser regions</w:t>
+        <w:t xml:space="preserve">(ribosome assembly), organized around</w:t>
+      </w:r>
+      <w:r>
+        <w:t xml:space="preserve"> </w:t>
+      </w:r>
+      <w:r>
+        <w:rPr>
+          <w:b/>
+          <w:bCs/>
+        </w:rPr>
+        <w:t xml:space="preserve">nucleolar organizer regions</w:t>
       </w:r>
       <w:r>
         <w:t xml:space="preserve"> </w:t>
@@ -8248,7 +8372,7 @@
         <w:t xml:space="preserve"> </w:t>
       </w:r>
       <w:r>
-        <w:t xml:space="preserve">— form a restricted set of cell types (haematopoietic stem cell).</w:t>
+        <w:t xml:space="preserve">— form a restricted set of cell types (hematopoietic stem cell).</w:t>
       </w:r>
     </w:p>
     <w:p>
@@ -8326,7 +8450,7 @@
         <w:t xml:space="preserve"> </w:t>
       </w:r>
       <w:r>
-        <w:t xml:space="preserve">(neurons, cardiac myocytes, lens fibres).</w:t>
+        <w:t xml:space="preserve">(neurons, cardiac myocytes, lens fibers).</w:t>
       </w:r>
     </w:p>
     <w:bookmarkEnd w:id="41"/>
@@ -8850,7 +8974,7 @@
         <w:t xml:space="preserve"> </w:t>
       </w:r>
       <w:r>
-        <w:t xml:space="preserve">causes progeria with premature ageing. Changes in nuclear shape and chromatin texture are also one of the oldest cancer-screening tools: the irregular, hyperchromatic nucleus of a dysplastic cervical cell is what a Pap smear is looking for.</w:t>
+        <w:t xml:space="preserve">causes progeria with premature aging. Changes in nuclear shape and chromatin texture are also one of the oldest cancer-screening tools: the irregular, hyperchromatic nucleus of a dysplastic cervical cell is what a Pap smear is looking for.</w:t>
       </w:r>
     </w:p>
     <w:p>
@@ -9093,7 +9217,7 @@
         <w:t xml:space="preserve">all substances that enter or leave an organ must cross this type of tissue</w:t>
       </w:r>
       <w:r>
-        <w:t xml:space="preserve">. Everything else — the number of layers, the shape of the cells, the specialisations on the apex — is a solution to one of four problems:</w:t>
+        <w:t xml:space="preserve">. Everything else — the number of layers, the shape of the cells, the specializations on the apex — is a solution to one of four problems:</w:t>
       </w:r>
       <w:r>
         <w:t xml:space="preserve"> </w:t>
@@ -9423,7 +9547,7 @@
         <w:t xml:space="preserve"> </w:t>
       </w:r>
       <w:r>
-        <w:t xml:space="preserve">— the cells responsible for the organ’s specialised functions — and the</w:t>
+        <w:t xml:space="preserve">— the cells responsible for the organ’s specialized functions — and the</w:t>
       </w:r>
       <w:r>
         <w:t xml:space="preserve"> </w:t>
@@ -9528,7 +9652,7 @@
         <w:t xml:space="preserve">myoepithelial cells</w:t>
       </w:r>
       <w:r>
-        <w:t xml:space="preserve">) or specialised sensory cells, such as those of taste buds or the olfactory epithelium.</w:t>
+        <w:t xml:space="preserve">) or specialized sensory cells, such as those of taste buds or the olfactory epithelium.</w:t>
       </w:r>
     </w:p>
     <w:p>
@@ -10893,7 +11017,7 @@
               <w:pStyle w:val="Compact"/>
             </w:pPr>
             <w:r>
-              <w:t xml:space="preserve">Oral cavity, oesophagus, vagina, anal canal, cornea</w:t>
+              <w:t xml:space="preserve">Oral cavity, esophagus, vagina, anal canal, cornea</w:t>
             </w:r>
           </w:p>
         </w:tc>
@@ -11910,7 +12034,7 @@
                 <w:b/>
                 <w:bCs/>
               </w:rPr>
-              <w:t xml:space="preserve">Fibroblast</w:t>
+              <w:t xml:space="preserve">Fibroblast / fibrocyte</w:t>
             </w:r>
           </w:p>
         </w:tc>
@@ -11932,7 +12056,23 @@
               <w:pStyle w:val="Compact"/>
             </w:pPr>
             <w:r>
-              <w:t xml:space="preserve">Synthesises collagen, elastin, GAGs</w:t>
+              <w:t xml:space="preserve">Synthesises collagen, elastin, GAGs;</w:t>
+            </w:r>
+            <w:r>
+              <w:t xml:space="preserve"> </w:t>
+            </w:r>
+            <w:r>
+              <w:rPr>
+                <w:b/>
+                <w:bCs/>
+              </w:rPr>
+              <w:t xml:space="preserve">fibrocyte</w:t>
+            </w:r>
+            <w:r>
+              <w:t xml:space="preserve"> </w:t>
+            </w:r>
+            <w:r>
+              <w:t xml:space="preserve">is the quiescent form</w:t>
             </w:r>
           </w:p>
         </w:tc>
@@ -12349,7 +12489,7 @@
               <w:pStyle w:val="Compact"/>
             </w:pPr>
             <w:r>
-              <w:t xml:space="preserve">Fibre</w:t>
+              <w:t xml:space="preserve">Fiber</w:t>
             </w:r>
           </w:p>
         </w:tc>
@@ -12758,7 +12898,7 @@
               <w:pStyle w:val="Compact"/>
             </w:pPr>
             <w:r>
-              <w:t xml:space="preserve">Reticular fibres</w:t>
+              <w:t xml:space="preserve">Reticular fibers</w:t>
             </w:r>
           </w:p>
         </w:tc>
@@ -13095,7 +13235,7 @@
         <w:t xml:space="preserve"> </w:t>
       </w:r>
       <w:r>
-        <w:t xml:space="preserve">— bleeding gums, poor wound healing, perifollicular haemorrhage. Without copper, cross-linking fails, as in</w:t>
+        <w:t xml:space="preserve">— bleeding gums, poor wound healing, perifollicular hemorrhage. Without copper, cross-linking fails, as in</w:t>
       </w:r>
       <w:r>
         <w:t xml:space="preserve"> </w:t>
@@ -13232,7 +13372,7 @@
         <w:t xml:space="preserve"> </w:t>
       </w:r>
       <w:r>
-        <w:t xml:space="preserve">are long unbranched polysaccharides with repeating disaccharides and many negative charges, which attract water:</w:t>
+        <w:t xml:space="preserve">(also called mucopolysaccharides) are long polymers of repeating disaccharide units, usually with many negative charges that attract water:</w:t>
       </w:r>
       <w:r>
         <w:t xml:space="preserve"> </w:t>
@@ -13248,7 +13388,39 @@
         <w:t xml:space="preserve"> </w:t>
       </w:r>
       <w:r>
-        <w:t xml:space="preserve">(unsulfated, not attached to protein, the backbone of the gel), chondroitin sulfate, keratan sulfate, dermatan sulfate, and heparan sulfate.</w:t>
+        <w:t xml:space="preserve">(the only</w:t>
+      </w:r>
+      <w:r>
+        <w:t xml:space="preserve"> </w:t>
+      </w:r>
+      <w:r>
+        <w:rPr>
+          <w:b/>
+          <w:bCs/>
+        </w:rPr>
+        <w:t xml:space="preserve">unsulfated</w:t>
+      </w:r>
+      <w:r>
+        <w:t xml:space="preserve"> </w:t>
+      </w:r>
+      <w:r>
+        <w:t xml:space="preserve">one, not attached to protein, and the backbone of the gel) and the</w:t>
+      </w:r>
+      <w:r>
+        <w:t xml:space="preserve"> </w:t>
+      </w:r>
+      <w:r>
+        <w:rPr>
+          <w:b/>
+          <w:bCs/>
+        </w:rPr>
+        <w:t xml:space="preserve">sulfated GAGs</w:t>
+      </w:r>
+      <w:r>
+        <w:t xml:space="preserve"> </w:t>
+      </w:r>
+      <w:r>
+        <w:t xml:space="preserve">— chondroitin sulfate, keratan sulfate, dermatan sulfate, and heparan sulfate.</w:t>
       </w:r>
     </w:p>
     <w:p>
@@ -13436,7 +13608,7 @@
         <w:t xml:space="preserve"> </w:t>
       </w:r>
       <w:r>
-        <w:t xml:space="preserve">— abundant ground substance, scattered fibres, many cells. Fills spaces, surrounds vessels, underlies epithelia.</w:t>
+        <w:t xml:space="preserve">— abundant ground substance, scattered fibers, many cells. Fills spaces, surrounds vessels, underlies epithelia.</w:t>
       </w:r>
     </w:p>
     <w:p>
@@ -13518,7 +13690,7 @@
         <w:t xml:space="preserve"> </w:t>
       </w:r>
       <w:r>
-        <w:t xml:space="preserve">— many elastic fibres; elastic ligament, vocal cord, large arteries.</w:t>
+        <w:t xml:space="preserve">— many elastic fibers; elastic ligament, vocal cord, large arteries.</w:t>
       </w:r>
     </w:p>
     <w:p>
@@ -13592,6 +13764,72 @@
         <w:pStyle w:val="FirstParagraph"/>
       </w:pPr>
       <w:r>
+        <w:t xml:space="preserve">Besides fibroblasts, the resident population includes</w:t>
+      </w:r>
+      <w:r>
+        <w:t xml:space="preserve"> </w:t>
+      </w:r>
+      <w:r>
+        <w:rPr>
+          <w:b/>
+          <w:bCs/>
+        </w:rPr>
+        <w:t xml:space="preserve">adipocytes</w:t>
+      </w:r>
+      <w:r>
+        <w:t xml:space="preserve">,</w:t>
+      </w:r>
+      <w:r>
+        <w:t xml:space="preserve"> </w:t>
+      </w:r>
+      <w:r>
+        <w:rPr>
+          <w:b/>
+          <w:bCs/>
+        </w:rPr>
+        <w:t xml:space="preserve">macrophages</w:t>
+      </w:r>
+      <w:r>
+        <w:t xml:space="preserve">, mast cells, and the</w:t>
+      </w:r>
+      <w:r>
+        <w:t xml:space="preserve"> </w:t>
+      </w:r>
+      <w:r>
+        <w:rPr>
+          <w:b/>
+          <w:bCs/>
+        </w:rPr>
+        <w:t xml:space="preserve">leukocytes</w:t>
+      </w:r>
+      <w:r>
+        <w:t xml:space="preserve"> </w:t>
+      </w:r>
+      <w:r>
+        <w:t xml:space="preserve">that migrate in (especially</w:t>
+      </w:r>
+      <w:r>
+        <w:t xml:space="preserve"> </w:t>
+      </w:r>
+      <w:r>
+        <w:rPr>
+          <w:b/>
+          <w:bCs/>
+        </w:rPr>
+        <w:t xml:space="preserve">lymphocytes</w:t>
+      </w:r>
+      <w:r>
+        <w:t xml:space="preserve"> </w:t>
+      </w:r>
+      <w:r>
+        <w:t xml:space="preserve">and plasma cells in chronic inflammation) — which is why the book lists several types of fixed and wandering cells.</w:t>
+      </w:r>
+    </w:p>
+    <w:p>
+      <w:pPr>
+        <w:pStyle w:val="BodyText"/>
+      </w:pPr>
+      <w:r>
         <w:rPr>
           <w:b/>
           <w:bCs/>
@@ -14119,7 +14357,7 @@
           <w:b/>
           <w:bCs/>
         </w:rPr>
-        <w:t xml:space="preserve">reticular fibres</w:t>
+        <w:t xml:space="preserve">reticular fibers</w:t>
       </w:r>
       <w:r>
         <w:t xml:space="preserve">, with connective tissue septa dividing the tissue into lobules.</w:t>
@@ -14793,7 +15031,39 @@
         <w:t xml:space="preserve"> </w:t>
       </w:r>
       <w:r>
-        <w:t xml:space="preserve">connective tissue that structurally supports soft tissues — notably in the respiratory tract — and provides</w:t>
+        <w:t xml:space="preserve">connective tissue whose</w:t>
+      </w:r>
+      <w:r>
+        <w:t xml:space="preserve"> </w:t>
+      </w:r>
+      <w:r>
+        <w:rPr>
+          <w:b/>
+          <w:bCs/>
+        </w:rPr>
+        <w:t xml:space="preserve">ECM</w:t>
+      </w:r>
+      <w:r>
+        <w:t xml:space="preserve"> </w:t>
+      </w:r>
+      <w:r>
+        <w:t xml:space="preserve">— collagen plus proteoglycan and water — is the bulk of the tissue;</w:t>
+      </w:r>
+      <w:r>
+        <w:t xml:space="preserve"> </w:t>
+      </w:r>
+      <w:r>
+        <w:rPr>
+          <w:b/>
+          <w:bCs/>
+        </w:rPr>
+        <w:t xml:space="preserve">fibroblasts</w:t>
+      </w:r>
+      <w:r>
+        <w:t xml:space="preserve"> </w:t>
+      </w:r>
+      <w:r>
+        <w:t xml:space="preserve">of the perichondrium, not chondrocytes, produce its outer fibrous layer. that structurally supports soft tissues — notably in the respiratory tract — and provides</w:t>
       </w:r>
       <w:r>
         <w:t xml:space="preserve"> </w:t>
@@ -14832,7 +15102,7 @@
         <w:t xml:space="preserve">Cartilage always lacks blood vessels, lymphatics, and nerves</w:t>
       </w:r>
       <w:r>
-        <w:t xml:space="preserve">, but usually has a vascularised</w:t>
+        <w:t xml:space="preserve">, but usually has a vascularized</w:t>
       </w:r>
       <w:r>
         <w:t xml:space="preserve"> </w:t>
@@ -15143,7 +15413,7 @@
           <w:b/>
           <w:bCs/>
         </w:rPr>
-        <w:t xml:space="preserve">elastic fibres</w:t>
+        <w:t xml:space="preserve">elastic fibers</w:t>
       </w:r>
       <w:r>
         <w:t xml:space="preserve">, giving flexibility with recoil. Found in the</w:t>
@@ -15388,7 +15658,7 @@
                 <w:b/>
                 <w:bCs/>
               </w:rPr>
-              <w:t xml:space="preserve">elastic fibres</w:t>
+              <w:t xml:space="preserve">elastic fibers</w:t>
             </w:r>
           </w:p>
         </w:tc>
@@ -15773,7 +16043,7 @@
           <w:b/>
           <w:bCs/>
         </w:rPr>
-        <w:t xml:space="preserve">glassy purple with cells in clusters = hyaline; wavy dark fibres = elastic; thick parallel pink bundles with cells in rows = fibrocartilage.</w:t>
+        <w:t xml:space="preserve">glassy purple with cells in clusters = hyaline; wavy dark fibers = elastic; thick parallel pink bundles with cells in rows = fibrocartilage.</w:t>
       </w:r>
     </w:p>
     <w:p>
@@ -17188,7 +17458,7 @@
           <w:b/>
           <w:bCs/>
         </w:rPr>
-        <w:t xml:space="preserve">primary ossification centre</w:t>
+        <w:t xml:space="preserve">primary ossification center</w:t>
       </w:r>
       <w:r>
         <w:t xml:space="preserve"> </w:t>
@@ -17204,7 +17474,7 @@
           <w:b/>
           <w:bCs/>
         </w:rPr>
-        <w:t xml:space="preserve">secondary centres</w:t>
+        <w:t xml:space="preserve">secondary centers</w:t>
       </w:r>
       <w:r>
         <w:t xml:space="preserve"> </w:t>
@@ -17254,7 +17524,7 @@
           <w:b/>
           <w:bCs/>
         </w:rPr>
-        <w:t xml:space="preserve">haematoma</w:t>
+        <w:t xml:space="preserve">hematoma</w:t>
       </w:r>
       <w:r>
         <w:t xml:space="preserve"> </w:t>
@@ -18018,7 +18288,7 @@
           <w:b/>
           <w:bCs/>
         </w:rPr>
-        <w:t xml:space="preserve">haematopoietic</w:t>
+        <w:t xml:space="preserve">hematopoietic</w:t>
       </w:r>
       <w:r>
         <w:t xml:space="preserve">, from the monocyte–macrophage line. The second is reversing the epiphyseal zones: growth happens at the</w:t>
@@ -18299,7 +18569,7 @@
         <w:t xml:space="preserve"> </w:t>
       </w:r>
       <w:r>
-        <w:t xml:space="preserve">— one per neuron, arises at the axon hillock, contains no Nissl bodies, specialised for conduction.</w:t>
+        <w:t xml:space="preserve">— one per neuron, arises at the axon hillock, contains no Nissl bodies, specialized for conduction.</w:t>
       </w:r>
     </w:p>
     <w:p>
@@ -18760,6 +19030,12 @@
               </w:rPr>
               <w:t xml:space="preserve">Schwann cell</w:t>
             </w:r>
+            <w:r>
+              <w:t xml:space="preserve"> </w:t>
+            </w:r>
+            <w:r>
+              <w:t xml:space="preserve">(neurolemmocyte)</w:t>
+            </w:r>
           </w:p>
         </w:tc>
         <w:tc>
@@ -18959,7 +19235,7 @@
         <w:t xml:space="preserve"> </w:t>
       </w:r>
       <w:r>
-        <w:t xml:space="preserve">are the output neurons; grey matter outside.</w:t>
+        <w:t xml:space="preserve">are the output neurons; gray matter outside.</w:t>
       </w:r>
     </w:p>
     <w:p>
@@ -19045,7 +19321,7 @@
         <w:t xml:space="preserve"> </w:t>
       </w:r>
       <w:r>
-        <w:t xml:space="preserve">— grey matter in an H-shaped core, white matter outside;</w:t>
+        <w:t xml:space="preserve">— gray matter in an H-shaped core, white matter outside;</w:t>
       </w:r>
       <w:r>
         <w:t xml:space="preserve"> </w:t>
@@ -19242,7 +19518,7 @@
         <w:t xml:space="preserve">epineurium</w:t>
       </w:r>
       <w:r>
-        <w:t xml:space="preserve">, individual fibres by</w:t>
+        <w:t xml:space="preserve">, individual fibers by</w:t>
       </w:r>
       <w:r>
         <w:t xml:space="preserve"> </w:t>
@@ -19713,7 +19989,7 @@
         <w:t xml:space="preserve"> </w:t>
       </w:r>
       <w:r>
-        <w:t xml:space="preserve">muscle → fascicles → fibres → myofibrils → myofilaments. Each fibre is a long, cylindrical,</w:t>
+        <w:t xml:space="preserve">muscle → fascicles → fibers → myofibrils → myofilaments. Each fiber is a long, cylindrical,</w:t>
       </w:r>
       <w:r>
         <w:t xml:space="preserve"> </w:t>
@@ -19817,7 +20093,7 @@
               <w:pStyle w:val="Compact"/>
             </w:pPr>
             <w:r>
-              <w:t xml:space="preserve">Behaviour in contraction</w:t>
+              <w:t xml:space="preserve">Behavior in contraction</w:t>
             </w:r>
           </w:p>
         </w:tc>
@@ -20155,7 +20431,7 @@
         <w:t xml:space="preserve">triad</w:t>
       </w:r>
       <w:r>
-        <w:t xml:space="preserve">. Depolarisation spreads along the T-tubules to trigger simultaneous Ca²⁺ release throughout the fibre. An action potential releases Ca²⁺, which binds</w:t>
+        <w:t xml:space="preserve">. Depolarisation spreads along the T-tubules to trigger simultaneous Ca²⁺ release throughout the fiber. An action potential releases Ca²⁺, which binds</w:t>
       </w:r>
       <w:r>
         <w:t xml:space="preserve"> </w:t>
@@ -20218,7 +20494,7 @@
         <w:t xml:space="preserve"> </w:t>
       </w:r>
       <w:r>
-        <w:t xml:space="preserve">— acetylcholine binds nicotinic receptors, depolarises the sarcolemma, and triggers contraction. One motor neuron plus all the fibres it supplies is a</w:t>
+        <w:t xml:space="preserve">— acetylcholine binds nicotinic receptors, depolarises the sarcolemma, and triggers contraction. One motor neuron plus all the fibers it supplies is a</w:t>
       </w:r>
       <w:r>
         <w:t xml:space="preserve"> </w:t>
@@ -20243,7 +20519,7 @@
           <w:b/>
           <w:bCs/>
         </w:rPr>
-        <w:t xml:space="preserve">Fibre types:</w:t>
+        <w:t xml:space="preserve">Fiber types:</w:t>
       </w:r>
     </w:p>
     <w:tbl>
@@ -20315,7 +20591,7 @@
               <w:pStyle w:val="Compact"/>
             </w:pPr>
             <w:r>
-              <w:t xml:space="preserve">Colour</w:t>
+              <w:t xml:space="preserve">Color</w:t>
             </w:r>
           </w:p>
         </w:tc>
@@ -20537,7 +20813,7 @@
         <w:t xml:space="preserve"> </w:t>
       </w:r>
       <w:r>
-        <w:t xml:space="preserve">(intrafusal fibres, Ia afferents, gamma motor neurons) sense length and stretch;</w:t>
+        <w:t xml:space="preserve">(intrafusal fibers, Ia afferents, gamma motor neurons) sense length and stretch;</w:t>
       </w:r>
       <w:r>
         <w:t xml:space="preserve"> </w:t>
@@ -20582,7 +20858,7 @@
         <w:t xml:space="preserve">Striated</w:t>
       </w:r>
       <w:r>
-        <w:t xml:space="preserve">, branched fibres,</w:t>
+        <w:t xml:space="preserve">, branched fibers,</w:t>
       </w:r>
       <w:r>
         <w:t xml:space="preserve"> </w:t>
@@ -20703,7 +20979,39 @@
         <w:t xml:space="preserve"> </w:t>
       </w:r>
       <w:r>
-        <w:t xml:space="preserve">(one T-tubule + one cisterna) rather than triads at the A–I junction.</w:t>
+        <w:t xml:space="preserve">(one T-tubule + one cisterna) rather than</w:t>
+      </w:r>
+      <w:r>
+        <w:t xml:space="preserve"> </w:t>
+      </w:r>
+      <w:r>
+        <w:rPr>
+          <w:b/>
+          <w:bCs/>
+        </w:rPr>
+        <w:t xml:space="preserve">triads</w:t>
+      </w:r>
+      <w:r>
+        <w:t xml:space="preserve"> </w:t>
+      </w:r>
+      <w:r>
+        <w:t xml:space="preserve">of the</w:t>
+      </w:r>
+      <w:r>
+        <w:t xml:space="preserve"> </w:t>
+      </w:r>
+      <w:r>
+        <w:rPr>
+          <w:b/>
+          <w:bCs/>
+        </w:rPr>
+        <w:t xml:space="preserve">transverse tubule system</w:t>
+      </w:r>
+      <w:r>
+        <w:t xml:space="preserve"> </w:t>
+      </w:r>
+      <w:r>
+        <w:t xml:space="preserve">at the A–I junction.</w:t>
       </w:r>
     </w:p>
     <w:p>
@@ -20731,13 +21039,13 @@
           <w:b/>
           <w:bCs/>
         </w:rPr>
-        <w:t xml:space="preserve">Purkinje fibres</w:t>
-      </w:r>
-      <w:r>
-        <w:t xml:space="preserve"> </w:t>
-      </w:r>
-      <w:r>
-        <w:t xml:space="preserve">— specialised conducting cells, larger and paler, with fewer myofibrils; they conduct rapidly through the ventricles.</w:t>
+        <w:t xml:space="preserve">Purkinje fibers</w:t>
+      </w:r>
+      <w:r>
+        <w:t xml:space="preserve"> </w:t>
+      </w:r>
+      <w:r>
+        <w:t xml:space="preserve">— specialized conducting cells, larger and paler, with fewer myofibrils; they conduct rapidly through the ventricles.</w:t>
       </w:r>
     </w:p>
     <w:p>
@@ -21409,7 +21717,7 @@
               <w:pStyle w:val="Compact"/>
             </w:pPr>
             <w:r>
-              <w:t xml:space="preserve">None between fibres</w:t>
+              <w:t xml:space="preserve">None between fibers</w:t>
             </w:r>
           </w:p>
         </w:tc>
@@ -21577,7 +21885,7 @@
         <w:t xml:space="preserve">dystrophin</w:t>
       </w:r>
       <w:r>
-        <w:t xml:space="preserve">, which links the sarcolemma to the extracellular matrix; without it, contraction tears the membrane, fibres die, and fat and fibrous tissue replace muscle (pseudohypertrophy).</w:t>
+        <w:t xml:space="preserve">, which links the sarcolemma to the extracellular matrix; without it, contraction tears the membrane, fibers die, and fat and fibrous tissue replace muscle (pseudohypertrophy).</w:t>
       </w:r>
       <w:r>
         <w:t xml:space="preserve"> </w:t>
@@ -21832,7 +22140,7 @@
         <w:t xml:space="preserve"> </w:t>
       </w:r>
       <w:r>
-        <w:t xml:space="preserve">— endothelium + subendothelial connective tissue + a layer of Purkinje fibres; continuous with the intima of vessels.</w:t>
+        <w:t xml:space="preserve">— endothelium + subendothelial connective tissue + a layer of Purkinje fibers; continuous with the intima of vessels.</w:t>
       </w:r>
     </w:p>
     <w:p>
@@ -21876,7 +22184,20 @@
         <w:t xml:space="preserve"> </w:t>
       </w:r>
       <w:r>
-        <w:t xml:space="preserve">— mesothelium + connective tissue + adipose; the visceral layer of the pericardium.</w:t>
+        <w:t xml:space="preserve">— connective tissue containing many</w:t>
+      </w:r>
+      <w:r>
+        <w:t xml:space="preserve"> </w:t>
+      </w:r>
+      <w:r>
+        <w:rPr>
+          <w:b/>
+          <w:bCs/>
+        </w:rPr>
+        <w:t xml:space="preserve">adipocytes</w:t>
+      </w:r>
+      <w:r>
+        <w:t xml:space="preserve">, covered by mesothelium; the visceral layer of the pericardium.</w:t>
       </w:r>
     </w:p>
     <w:p>
@@ -22623,7 +22944,7 @@
                 <w:b/>
                 <w:bCs/>
               </w:rPr>
-              <w:t xml:space="preserve">leucocyte diapedesis</w:t>
+              <w:t xml:space="preserve">leukocyte diapedesis</w:t>
             </w:r>
           </w:p>
         </w:tc>
@@ -23149,7 +23470,7 @@
         <w:t xml:space="preserve"> </w:t>
       </w:r>
       <w:r>
-        <w:t xml:space="preserve">and no fenestrations — which is exactly why tumour cells and bacteria enter them so easily.</w:t>
+        <w:t xml:space="preserve">and no fenestrations — which is exactly why tumor cells and bacteria enter them so easily.</w:t>
       </w:r>
     </w:p>
     <w:p>
@@ -23212,7 +23533,7 @@
         <w:t xml:space="preserve"> </w:t>
       </w:r>
       <w:r>
-        <w:t xml:space="preserve">follows destruction of medial elastic fibres.</w:t>
+        <w:t xml:space="preserve">follows destruction of medial elastic fibers.</w:t>
       </w:r>
       <w:r>
         <w:t xml:space="preserve"> </w:t>
@@ -23553,7 +23874,7 @@
         <w:t xml:space="preserve"> </w:t>
       </w:r>
       <w:r>
-        <w:t xml:space="preserve">at the centre — flexible enough to pass small capillaries;</w:t>
+        <w:t xml:space="preserve">at the center — flexible enough to pass small capillaries;</w:t>
       </w:r>
       <w:r>
         <w:t xml:space="preserve"> </w:t>
@@ -23566,7 +23887,7 @@
         <w:t xml:space="preserve">no nucleus, no organelles</w:t>
       </w:r>
       <w:r>
-        <w:t xml:space="preserve">, so the cell is packed with haemoglobin.</w:t>
+        <w:t xml:space="preserve">, so the cell is packed with hemoglobin.</w:t>
       </w:r>
     </w:p>
     <w:p>
@@ -23578,14 +23899,20 @@
         </w:numPr>
       </w:pPr>
       <w:r>
-        <w:rPr>
-          <w:b/>
-          <w:bCs/>
-        </w:rPr>
-        <w:t xml:space="preserve">120-day lifespan</w:t>
-      </w:r>
-      <w:r>
-        <w:t xml:space="preserve">; removed by splenic macrophages; the globin is recycled and the haem converted to bilirubin.</w:t>
+        <w:t xml:space="preserve">Lifespan about</w:t>
+      </w:r>
+      <w:r>
+        <w:t xml:space="preserve"> </w:t>
+      </w:r>
+      <w:r>
+        <w:rPr>
+          <w:b/>
+          <w:bCs/>
+        </w:rPr>
+        <w:t xml:space="preserve">120 days</w:t>
+      </w:r>
+      <w:r>
+        <w:t xml:space="preserve">; removed by splenic macrophages; the globin is recycled and the hem converted to bilirubin.</w:t>
       </w:r>
     </w:p>
     <w:p>
@@ -23626,13 +23953,13 @@
           <w:b/>
           <w:bCs/>
         </w:rPr>
-        <w:t xml:space="preserve">Haemoglobin</w:t>
-      </w:r>
-      <w:r>
-        <w:t xml:space="preserve"> </w:t>
-      </w:r>
-      <w:r>
-        <w:t xml:space="preserve">— four globin chains, each with a haem group carrying Fe²⁺. Adult HbA (α₂β₂) and fetal HbF (α₂γ₂, higher affinity for O₂).</w:t>
+        <w:t xml:space="preserve">Hemoglobin</w:t>
+      </w:r>
+      <w:r>
+        <w:t xml:space="preserve"> </w:t>
+      </w:r>
+      <w:r>
+        <w:t xml:space="preserve">— four globin chains, each with a hem group carrying Fe²⁺. Adult HbA (α₂β₂) and fetal HbF (α₂γ₂, higher affinity for O₂).</w:t>
       </w:r>
     </w:p>
     <w:p>
@@ -23670,7 +23997,7 @@
           <w:b/>
           <w:bCs/>
         </w:rPr>
-        <w:t xml:space="preserve">Haematocrit</w:t>
+        <w:t xml:space="preserve">Hematocrit</w:t>
       </w:r>
       <w:r>
         <w:t xml:space="preserve"> </w:t>
@@ -23708,7 +24035,7 @@
         <w:t xml:space="preserve"> </w:t>
       </w:r>
       <w:r>
-        <w:t xml:space="preserve">of leucocytes and platelets. An average adult has</w:t>
+        <w:t xml:space="preserve">of leukocytes and platelets. An average adult has</w:t>
       </w:r>
       <w:r>
         <w:t xml:space="preserve"> </w:t>
@@ -23736,7 +24063,45 @@
           <w:b/>
           <w:bCs/>
         </w:rPr>
-        <w:t xml:space="preserve">The leucocytes</w:t>
+        <w:t xml:space="preserve">The leukocytes</w:t>
+      </w:r>
+      <w:r>
+        <w:t xml:space="preserve"> </w:t>
+      </w:r>
+      <w:r>
+        <w:t xml:space="preserve">— broadly grouped as</w:t>
+      </w:r>
+      <w:r>
+        <w:t xml:space="preserve"> </w:t>
+      </w:r>
+      <w:r>
+        <w:rPr>
+          <w:b/>
+          <w:bCs/>
+        </w:rPr>
+        <w:t xml:space="preserve">granulocytes</w:t>
+      </w:r>
+      <w:r>
+        <w:t xml:space="preserve"> </w:t>
+      </w:r>
+      <w:r>
+        <w:t xml:space="preserve">(neutrophils, eosinophils, basophils) and</w:t>
+      </w:r>
+      <w:r>
+        <w:t xml:space="preserve"> </w:t>
+      </w:r>
+      <w:r>
+        <w:rPr>
+          <w:b/>
+          <w:bCs/>
+        </w:rPr>
+        <w:t xml:space="preserve">agranulocytes</w:t>
+      </w:r>
+      <w:r>
+        <w:t xml:space="preserve"> </w:t>
+      </w:r>
+      <w:r>
+        <w:t xml:space="preserve">(lymphocytes, monocytes)</w:t>
       </w:r>
     </w:p>
     <w:tbl>
@@ -24289,7 +24654,7 @@
               <w:pStyle w:val="Compact"/>
             </w:pPr>
             <w:r>
-              <w:t xml:space="preserve">Abundant blue-grey</w:t>
+              <w:t xml:space="preserve">Abundant blue-gray</w:t>
             </w:r>
           </w:p>
         </w:tc>
@@ -24370,7 +24735,23 @@
         <w:t xml:space="preserve">pus</w:t>
       </w:r>
       <w:r>
-        <w:t xml:space="preserve">.</w:t>
+        <w:t xml:space="preserve">. Each</w:t>
+      </w:r>
+      <w:r>
+        <w:t xml:space="preserve"> </w:t>
+      </w:r>
+      <w:r>
+        <w:rPr>
+          <w:b/>
+          <w:bCs/>
+        </w:rPr>
+        <w:t xml:space="preserve">phagocyte</w:t>
+      </w:r>
+      <w:r>
+        <w:t xml:space="preserve"> </w:t>
+      </w:r>
+      <w:r>
+        <w:t xml:space="preserve">kills ingested bacteria inside a phagolysosome.</w:t>
       </w:r>
     </w:p>
     <w:p>
@@ -24404,7 +24785,7 @@
         <w:t xml:space="preserve"> </w:t>
       </w:r>
       <w:r>
-        <w:t xml:space="preserve">cytoplasm, with a peripheral clear zone (hyalomere) and a central granular zone (granulomere). They adhere, activate, and aggregate to form the primary haemostatic plug;</w:t>
+        <w:t xml:space="preserve">cytoplasm, with a peripheral clear zone (hyalomere) and a central granular zone (granulomere). They adhere, activate, and aggregate to form the primary hemostatic plug;</w:t>
       </w:r>
       <w:r>
         <w:t xml:space="preserve"> </w:t>
@@ -24486,7 +24867,7 @@
         <w:t xml:space="preserve"> </w:t>
       </w:r>
       <w:r>
-        <w:t xml:space="preserve">viral infection or chronic lymphocytic leukaemia;</w:t>
+        <w:t xml:space="preserve">viral infection or chronic lymphocytic leukemia;</w:t>
       </w:r>
       <w:r>
         <w:t xml:space="preserve"> </w:t>
@@ -24760,33 +25141,33 @@
           <w:b/>
           <w:bCs/>
         </w:rPr>
-        <w:t xml:space="preserve">haematopoietic stem cell</w:t>
-      </w:r>
-      <w:r>
-        <w:t xml:space="preserve">, and the pathway from that cell to a mature erythrocyte, granulocyte, or platelet is a sequence of named stages you can recognise by</w:t>
-      </w:r>
-      <w:r>
-        <w:t xml:space="preserve"> </w:t>
-      </w:r>
-      <w:r>
-        <w:rPr>
-          <w:b/>
-          <w:bCs/>
-        </w:rPr>
-        <w:t xml:space="preserve">decreasing nucleus, increasing cytoplasm, and changing colour</w:t>
+        <w:t xml:space="preserve">hematopoietic stem cell</w:t>
+      </w:r>
+      <w:r>
+        <w:t xml:space="preserve">, and the pathway from that cell to a mature erythrocyte, granulocyte, or platelet is a sequence of named stages you can recognize by</w:t>
+      </w:r>
+      <w:r>
+        <w:t xml:space="preserve"> </w:t>
+      </w:r>
+      <w:r>
+        <w:rPr>
+          <w:b/>
+          <w:bCs/>
+        </w:rPr>
+        <w:t xml:space="preserve">decreasing nucleus, increasing cytoplasm, and changing color</w:t>
       </w:r>
       <w:r>
         <w:t xml:space="preserve">. It is the most examinable lineage in histology because every stage has a name.</w:t>
       </w:r>
     </w:p>
     <w:bookmarkEnd w:id="107"/>
-    <w:bookmarkStart w:id="108" w:name="sites-of-haemopoiesis"/>
+    <w:bookmarkStart w:id="108" w:name="sites-of-hemopoiesis"/>
     <w:p>
       <w:pPr>
         <w:pStyle w:val="Heading3"/>
       </w:pPr>
       <w:r>
-        <w:t xml:space="preserve">Sites of haemopoiesis</w:t>
+        <w:t xml:space="preserve">Sites of hemopoiesis</w:t>
       </w:r>
     </w:p>
     <w:tbl>
@@ -25007,7 +25388,7 @@
           <w:b/>
           <w:bCs/>
         </w:rPr>
-        <w:t xml:space="preserve">haematopoietic stem cell</w:t>
+        <w:t xml:space="preserve">hematopoietic stem cell</w:t>
       </w:r>
       <w:r>
         <w:t xml:space="preserve"> </w:t>
@@ -25353,7 +25734,7 @@
           <w:b/>
           <w:bCs/>
         </w:rPr>
-        <w:t xml:space="preserve">haemopoietic cords</w:t>
+        <w:t xml:space="preserve">hemopoietic cords</w:t>
       </w:r>
       <w:r>
         <w:t xml:space="preserve"> </w:t>
@@ -25404,7 +25785,7 @@
         <w:t xml:space="preserve">2:1 to 4:1</w:t>
       </w:r>
       <w:r>
-        <w:t xml:space="preserve">; it shifts toward erythroid in haemolytic anaemia and toward myeloid in infection or leukaemia.</w:t>
+        <w:t xml:space="preserve">; it shifts toward erythroid in hemolytic anaemia and toward myeloid in infection or leukemia.</w:t>
       </w:r>
     </w:p>
     <w:bookmarkEnd w:id="110"/>
@@ -25452,7 +25833,7 @@
           <w:b/>
           <w:bCs/>
         </w:rPr>
-        <w:t xml:space="preserve">RNA-rich to haemoglobin-filled</w:t>
+        <w:t xml:space="preserve">RNA-rich to hemoglobin-filled</w:t>
       </w:r>
       <w:r>
         <w:t xml:space="preserve">; at the last stage the nucleus is</w:t>
@@ -25518,7 +25899,7 @@
         <w:t xml:space="preserve">condenses and is extruded</w:t>
       </w:r>
       <w:r>
-        <w:t xml:space="preserve">, haemoglobin accumulates so the cytoplasm shifts from blue to pink, and the nucleolus disappears. The sequence takes about</w:t>
+        <w:t xml:space="preserve">, hemoglobin accumulates so the cytoplasm shifts from blue to pink, and the nucleolus disappears. The sequence takes about</w:t>
       </w:r>
       <w:r>
         <w:t xml:space="preserve"> </w:t>
@@ -25561,6 +25942,134 @@
         <w:pStyle w:val="BodyText"/>
       </w:pPr>
       <w:r>
+        <w:t xml:space="preserve">The suffixes carry the meaning:</w:t>
+      </w:r>
+      <w:r>
+        <w:t xml:space="preserve"> </w:t>
+      </w:r>
+      <w:r>
+        <w:rPr>
+          <w:b/>
+          <w:bCs/>
+        </w:rPr>
+        <w:t xml:space="preserve">-blast</w:t>
+      </w:r>
+      <w:r>
+        <w:t xml:space="preserve"> </w:t>
+      </w:r>
+      <w:r>
+        <w:t xml:space="preserve">= dividing precursor (</w:t>
+      </w:r>
+      <w:r>
+        <w:rPr>
+          <w:b/>
+          <w:bCs/>
+        </w:rPr>
+        <w:t xml:space="preserve">myeloblast</w:t>
+      </w:r>
+      <w:r>
+        <w:t xml:space="preserve">,</w:t>
+      </w:r>
+      <w:r>
+        <w:t xml:space="preserve"> </w:t>
+      </w:r>
+      <w:r>
+        <w:rPr>
+          <w:b/>
+          <w:bCs/>
+        </w:rPr>
+        <w:t xml:space="preserve">lymphoblast</w:t>
+      </w:r>
+      <w:r>
+        <w:t xml:space="preserve">,</w:t>
+      </w:r>
+      <w:r>
+        <w:t xml:space="preserve"> </w:t>
+      </w:r>
+      <w:r>
+        <w:rPr>
+          <w:b/>
+          <w:bCs/>
+        </w:rPr>
+        <w:t xml:space="preserve">proerythroblast</w:t>
+      </w:r>
+      <w:r>
+        <w:t xml:space="preserve">),</w:t>
+      </w:r>
+      <w:r>
+        <w:t xml:space="preserve"> </w:t>
+      </w:r>
+      <w:r>
+        <w:rPr>
+          <w:b/>
+          <w:bCs/>
+        </w:rPr>
+        <w:t xml:space="preserve">-cyte</w:t>
+      </w:r>
+      <w:r>
+        <w:t xml:space="preserve"> </w:t>
+      </w:r>
+      <w:r>
+        <w:t xml:space="preserve">= the later, non-dividing cell (</w:t>
+      </w:r>
+      <w:r>
+        <w:rPr>
+          <w:b/>
+          <w:bCs/>
+        </w:rPr>
+        <w:t xml:space="preserve">myelocyte</w:t>
+      </w:r>
+      <w:r>
+        <w:t xml:space="preserve">,</w:t>
+      </w:r>
+      <w:r>
+        <w:t xml:space="preserve"> </w:t>
+      </w:r>
+      <w:r>
+        <w:rPr>
+          <w:b/>
+          <w:bCs/>
+        </w:rPr>
+        <w:t xml:space="preserve">lymphocyte</w:t>
+      </w:r>
+      <w:r>
+        <w:t xml:space="preserve">,</w:t>
+      </w:r>
+      <w:r>
+        <w:t xml:space="preserve"> </w:t>
+      </w:r>
+      <w:r>
+        <w:rPr>
+          <w:b/>
+          <w:bCs/>
+        </w:rPr>
+        <w:t xml:space="preserve">reticulocyte</w:t>
+      </w:r>
+      <w:r>
+        <w:t xml:space="preserve">);</w:t>
+      </w:r>
+      <w:r>
+        <w:t xml:space="preserve"> </w:t>
+      </w:r>
+      <w:r>
+        <w:rPr>
+          <w:b/>
+          <w:bCs/>
+        </w:rPr>
+        <w:t xml:space="preserve">thrombocyte</w:t>
+      </w:r>
+      <w:r>
+        <w:t xml:space="preserve"> </w:t>
+      </w:r>
+      <w:r>
+        <w:t xml:space="preserve">is another name for the platelet.</w:t>
+      </w:r>
+    </w:p>
+    <w:p>
+      <w:pPr>
+        <w:pStyle w:val="BodyText"/>
+      </w:pPr>
+      <w:r>
         <w:rPr>
           <w:b/>
           <w:bCs/>
@@ -25764,7 +26273,7 @@
           <w:b/>
           <w:bCs/>
         </w:rPr>
-        <w:t xml:space="preserve">Leukaemia</w:t>
+        <w:t xml:space="preserve">Leukemia</w:t>
       </w:r>
       <w:r>
         <w:t xml:space="preserve"> </w:t>
@@ -25802,7 +26311,7 @@
         <w:t xml:space="preserve"> </w:t>
       </w:r>
       <w:r>
-        <w:t xml:space="preserve">produces microcytic hypochromic cells because haemoglobin synthesis lags behind cell division.</w:t>
+        <w:t xml:space="preserve">produces microcytic hypochromic cells because hemoglobin synthesis lags behind cell division.</w:t>
       </w:r>
     </w:p>
     <w:p>
@@ -25830,7 +26339,7 @@
           <w:b/>
           <w:bCs/>
         </w:rPr>
-        <w:t xml:space="preserve">nucleus-to-cytoplasm ratio and granule colour</w:t>
+        <w:t xml:space="preserve">nucleus-to-cytoplasm ratio and granule color</w:t>
       </w:r>
       <w:r>
         <w:t xml:space="preserve">. Early cells have a large nucleus, a thin rim of basophilic cytoplasm, and a nucleolus. As cells mature, the ratio falls, granules appear, and the nucleus condenses.</w:t>
@@ -25843,7 +26352,7 @@
           <w:b/>
           <w:bCs/>
         </w:rPr>
-        <w:t xml:space="preserve">Maturation moves in one direction: nucleus shrinks, cytoplasm grows, colour shifts from blue to pink or from blue to granular.</w:t>
+        <w:t xml:space="preserve">Maturation moves in one direction: nucleus shrinks, cytoplasm grows, color shifts from blue to pink or from blue to granular.</w:t>
       </w:r>
     </w:p>
     <w:p>
@@ -26275,7 +26784,7 @@
         <w:t xml:space="preserve"> </w:t>
       </w:r>
       <w:r>
-        <w:t xml:space="preserve">(directed leucocyte migration), and</w:t>
+        <w:t xml:space="preserve">(directed leukocyte migration), and</w:t>
       </w:r>
       <w:r>
         <w:t xml:space="preserve"> </w:t>
@@ -26291,7 +26800,7 @@
         <w:t xml:space="preserve"> </w:t>
       </w:r>
       <w:r>
-        <w:t xml:space="preserve">(haemopoiesis, Chapter 13). Cytokines act locally (paracrine) or on the secreting cell (autocrine), and their Storm-like excess produces the systemic inflammatory response.</w:t>
+        <w:t xml:space="preserve">(hemopoiesis, Chapter 13). Cytokines act locally (paracrine) or on the secreting cell (autocrine), and their Storm-like excess produces the systemic inflammatory response.</w:t>
       </w:r>
     </w:p>
     <w:bookmarkEnd w:id="118"/>
@@ -26319,7 +26828,7 @@
         <w:t xml:space="preserve"> </w:t>
       </w:r>
       <w:r>
-        <w:t xml:space="preserve">are molecules recognised by the adaptive immune system;</w:t>
+        <w:t xml:space="preserve">are molecules recognized by the adaptive immune system;</w:t>
       </w:r>
       <w:r>
         <w:t xml:space="preserve"> </w:t>
@@ -26624,7 +27133,7 @@
         <w:t xml:space="preserve"> </w:t>
       </w:r>
       <w:r>
-        <w:t xml:space="preserve">They recognise peptide displayed on</w:t>
+        <w:t xml:space="preserve">They recognize peptide displayed on</w:t>
       </w:r>
       <w:r>
         <w:t xml:space="preserve"> </w:t>
@@ -27088,7 +27597,7 @@
         <w:t xml:space="preserve"> </w:t>
       </w:r>
       <w:r>
-        <w:t xml:space="preserve">to which lymphocytes attach instead of reticulin fibres; these TECs are</w:t>
+        <w:t xml:space="preserve">to which lymphocytes attach instead of reticulin fibers; these TECs are</w:t>
       </w:r>
       <w:r>
         <w:t xml:space="preserve"> </w:t>
@@ -27397,7 +27906,7 @@
                 <w:b/>
                 <w:bCs/>
               </w:rPr>
-              <w:t xml:space="preserve">germinal centre</w:t>
+              <w:t xml:space="preserve">germinal center</w:t>
             </w:r>
             <w:r>
               <w:t xml:space="preserve"> </w:t>
@@ -27725,7 +28234,7 @@
           <w:b/>
           <w:bCs/>
         </w:rPr>
-        <w:t xml:space="preserve">extramedullary haemopoiesis</w:t>
+        <w:t xml:space="preserve">extramedullary hemopoiesis</w:t>
       </w:r>
       <w:r>
         <w:t xml:space="preserve"> </w:t>
@@ -28196,7 +28705,7 @@
           <w:b/>
           <w:bCs/>
         </w:rPr>
-        <w:t xml:space="preserve">“what is at the centre of the nodule?”</w:t>
+        <w:t xml:space="preserve">“what is at the center of the nodule?”</w:t>
       </w:r>
       <w:r>
         <w:t xml:space="preserve"> </w:t>
@@ -28375,7 +28884,7 @@
         <w:t xml:space="preserve">grinding, acidifying, absorbing, or dehydrating</w:t>
       </w:r>
       <w:r>
-        <w:t xml:space="preserve">. Learn the four layers and their regional variations and you can describe any segment from oesophagus to anus.</w:t>
+        <w:t xml:space="preserve">. Learn the four layers and their regional variations and you can describe any segment from esophagus to anus.</w:t>
       </w:r>
     </w:p>
     <w:bookmarkEnd w:id="128"/>
@@ -29194,7 +29703,7 @@
           <w:b/>
           <w:bCs/>
         </w:rPr>
-        <w:t xml:space="preserve">oesophageal cardiac glands</w:t>
+        <w:t xml:space="preserve">esophageal cardiac glands</w:t>
       </w:r>
       <w:r>
         <w:t xml:space="preserve"> </w:t>
@@ -29210,7 +29719,7 @@
           <w:b/>
           <w:bCs/>
         </w:rPr>
-        <w:t xml:space="preserve">oesophageal glands</w:t>
+        <w:t xml:space="preserve">esophageal glands</w:t>
       </w:r>
       <w:r>
         <w:t xml:space="preserve"> </w:t>
@@ -30199,7 +30708,7 @@
         <w:t xml:space="preserve">dentate (pectinate) line</w:t>
       </w:r>
       <w:r>
-        <w:t xml:space="preserve">, an important clinical zone for haemorrhoids and anal cancer.</w:t>
+        <w:t xml:space="preserve">, an important clinical zone for hemorrhoids and anal cancer.</w:t>
       </w:r>
     </w:p>
     <w:p>
@@ -30291,7 +30800,7 @@
           <w:b/>
           <w:bCs/>
         </w:rPr>
-        <w:t xml:space="preserve">Barrett oesophagus</w:t>
+        <w:t xml:space="preserve">Barrett esophagus</w:t>
       </w:r>
       <w:r>
         <w:t xml:space="preserve"> </w:t>
@@ -31183,7 +31692,7 @@
         <w:t xml:space="preserve"> </w:t>
       </w:r>
       <w:r>
-        <w:t xml:space="preserve">at the centre and</w:t>
+        <w:t xml:space="preserve">at the center and</w:t>
       </w:r>
       <w:r>
         <w:t xml:space="preserve"> </w:t>
@@ -31694,7 +32203,7 @@
         <w:t xml:space="preserve"> </w:t>
       </w:r>
       <w:r>
-        <w:t xml:space="preserve">— The liver is recognised by</w:t>
+        <w:t xml:space="preserve">— The liver is recognized by</w:t>
       </w:r>
       <w:r>
         <w:t xml:space="preserve"> </w:t>
@@ -31805,7 +32314,7 @@
         <w:t xml:space="preserve"> </w:t>
       </w:r>
       <w:r>
-        <w:t xml:space="preserve">“everything flows to the centre”</w:t>
+        <w:t xml:space="preserve">“everything flows to the center”</w:t>
       </w:r>
       <w:r>
         <w:t xml:space="preserve"> </w:t>
@@ -32054,7 +32563,7 @@
         <w:t xml:space="preserve"> </w:t>
       </w:r>
       <w:r>
-        <w:t xml:space="preserve">— stratified squamous epithelium, continuous with the oral cavity and oesophagus. The change from respiratory to stratified squamous epithelium marks the point where the airway is exposed to abrasion from food.</w:t>
+        <w:t xml:space="preserve">— stratified squamous epithelium, continuous with the oral cavity and esophagus. The change from respiratory to stratified squamous epithelium marks the point where the airway is exposed to abrasion from food.</w:t>
       </w:r>
     </w:p>
     <w:bookmarkEnd w:id="144"/>
@@ -32184,7 +32693,7 @@
         <w:t xml:space="preserve"> </w:t>
       </w:r>
       <w:r>
-        <w:t xml:space="preserve">— elastic fibres, lymphocytes.</w:t>
+        <w:t xml:space="preserve">— elastic fibers, lymphocytes.</w:t>
       </w:r>
     </w:p>
     <w:p>
@@ -32263,7 +32772,7 @@
         <w:t xml:space="preserve"> </w:t>
       </w:r>
       <w:r>
-        <w:t xml:space="preserve">— smooth muscle bridging the gap posteriorly, allowing the oesophagus to expand.</w:t>
+        <w:t xml:space="preserve">— smooth muscle bridging the gap posteriorly, allowing the esophagus to expand.</w:t>
       </w:r>
     </w:p>
     <w:bookmarkEnd w:id="146"/>
@@ -32891,7 +33400,7 @@
         <w:t xml:space="preserve"> </w:t>
       </w:r>
       <w:r>
-        <w:t xml:space="preserve">— bronchoconstriction, mucosal oedema, eosinophilic inflammation, thickened basement membrane and smooth muscle hypertrophy.</w:t>
+        <w:t xml:space="preserve">— bronchoconstriction, mucosal edema, eosinophilic inflammation, thickened basement membrane and smooth muscle hypertrophy.</w:t>
       </w:r>
       <w:r>
         <w:t xml:space="preserve"> </w:t>
@@ -33795,7 +34304,7 @@
         <w:t xml:space="preserve"> </w:t>
       </w:r>
       <w:r>
-        <w:t xml:space="preserve">— dense irregular connective tissue with thick collagen bundles and elastic fibres.</w:t>
+        <w:t xml:space="preserve">— dense irregular connective tissue with thick collagen bundles and elastic fibers.</w:t>
       </w:r>
     </w:p>
     <w:p>
@@ -34896,7 +35405,7 @@
         <w:t xml:space="preserve"> </w:t>
       </w:r>
       <w:r>
-        <w:t xml:space="preserve">(loops of Henle, collecting ducts, vasa recta) organised into</w:t>
+        <w:t xml:space="preserve">(loops of Henle, collecting ducts, vasa recta) organized into</w:t>
       </w:r>
       <w:r>
         <w:t xml:space="preserve"> </w:t>
@@ -36051,7 +36560,7 @@
         <w:t xml:space="preserve"> </w:t>
       </w:r>
       <w:r>
-        <w:t xml:space="preserve">— heavy proteinuria, hypoalbuminaemia, oedema, hyperlipidaemia; podocyte injury is central.</w:t>
+        <w:t xml:space="preserve">— heavy proteinuria, hypoalbuminaemia, edema, hyperlipidaemia; podocyte injury is central.</w:t>
       </w:r>
       <w:r>
         <w:t xml:space="preserve"> </w:t>
@@ -36273,7 +36782,7 @@
         <w:pStyle w:val="FirstParagraph"/>
       </w:pPr>
       <w:r>
-        <w:t xml:space="preserve">Endocrine glands release hormone into the blood, so their histology is organised around</w:t>
+        <w:t xml:space="preserve">Endocrine glands release hormone into the blood, so their histology is organized around</w:t>
       </w:r>
       <w:r>
         <w:t xml:space="preserve"> </w:t>
@@ -36289,7 +36798,7 @@
         <w:t xml:space="preserve"> </w:t>
       </w:r>
       <w:r>
-        <w:t xml:space="preserve">rather than ducts. The three patterns to recognise are</w:t>
+        <w:t xml:space="preserve">rather than ducts. The three patterns to recognize are</w:t>
       </w:r>
       <w:r>
         <w:t xml:space="preserve"> </w:t>
@@ -37172,7 +37681,7 @@
         <w:t xml:space="preserve">β (insulin, 60–70%), α (glucagon, 20–25%), δ (somatostatin), PP, ε (ghrelin)</w:t>
       </w:r>
       <w:r>
-        <w:t xml:space="preserve">. Islets are richly vascularised, and their hormones pass directly into the bloodstream rather than into ducts.</w:t>
+        <w:t xml:space="preserve">. Islets are richly vascularized, and their hormones pass directly into the bloodstream rather than into ducts.</w:t>
       </w:r>
     </w:p>
     <w:bookmarkEnd w:id="172"/>
@@ -37598,7 +38107,7 @@
         <w:t xml:space="preserve"> </w:t>
       </w:r>
       <w:r>
-        <w:t xml:space="preserve">and germinal centres.</w:t>
+        <w:t xml:space="preserve">and germinal centers.</w:t>
       </w:r>
       <w:r>
         <w:t xml:space="preserve"> </w:t>
@@ -37646,7 +38155,7 @@
         <w:t xml:space="preserve"> </w:t>
       </w:r>
       <w:r>
-        <w:t xml:space="preserve">— a chromaffin-cell tumour producing episodic hypertension.</w:t>
+        <w:t xml:space="preserve">— a chromaffin-cell tumor producing episodic hypertension.</w:t>
       </w:r>
       <w:r>
         <w:t xml:space="preserve"> </w:t>
@@ -38982,13 +39491,13 @@
           <w:b/>
           <w:bCs/>
         </w:rPr>
-        <w:t xml:space="preserve">Testicular tumours</w:t>
-      </w:r>
-      <w:r>
-        <w:t xml:space="preserve"> </w:t>
-      </w:r>
-      <w:r>
-        <w:t xml:space="preserve">— germ-cell tumours in young men; a painless mass is malignant until proven otherwise.</w:t>
+        <w:t xml:space="preserve">Testicular tumors</w:t>
+      </w:r>
+      <w:r>
+        <w:t xml:space="preserve"> </w:t>
+      </w:r>
+      <w:r>
+        <w:t xml:space="preserve">— germ-cell tumors in young men; a painless mass is malignant until proven otherwise.</w:t>
       </w:r>
     </w:p>
     <w:p>
@@ -40113,7 +40622,7 @@
               <w:pStyle w:val="Compact"/>
             </w:pPr>
             <w:r>
-              <w:t xml:space="preserve">Shedding, haemorrhage, neutrophilic infiltrate</w:t>
+              <w:t xml:space="preserve">Shedding, hemorrhage, neutrophilic infiltrate</w:t>
             </w:r>
           </w:p>
         </w:tc>
@@ -40590,7 +41099,7 @@
         <w:t xml:space="preserve">glycogen</w:t>
       </w:r>
       <w:r>
-        <w:t xml:space="preserve">, no glands (lubrication comes from cervical and Bartholin glands), and a lamina propria with elastic fibres and venous plexuses.</w:t>
+        <w:t xml:space="preserve">, no glands (lubrication comes from cervical and Bartholin glands), and a lamina propria with elastic fibers and venous plexuses.</w:t>
       </w:r>
       <w:r>
         <w:t xml:space="preserve"> </w:t>
@@ -40941,7 +41450,7 @@
         <w:t xml:space="preserve"> </w:t>
       </w:r>
       <w:r>
-        <w:t xml:space="preserve">— a benign smooth-muscle tumour of the myometrium.</w:t>
+        <w:t xml:space="preserve">— a benign smooth-muscle tumor of the myometrium.</w:t>
       </w:r>
       <w:r>
         <w:t xml:space="preserve"> </w:t>
@@ -41209,7 +41718,7 @@
           <w:b/>
           <w:bCs/>
         </w:rPr>
-        <w:t xml:space="preserve">specialised epithelium</w:t>
+        <w:t xml:space="preserve">specialized epithelium</w:t>
       </w:r>
       <w:r>
         <w:t xml:space="preserve"> </w:t>
@@ -41691,7 +42200,7 @@
           <w:b/>
           <w:bCs/>
         </w:rPr>
-        <w:t xml:space="preserve">zonular fibres</w:t>
+        <w:t xml:space="preserve">zonular fibers</w:t>
       </w:r>
       <w:r>
         <w:t xml:space="preserve"> </w:t>
@@ -41852,7 +42361,7 @@
           <w:b/>
           <w:bCs/>
         </w:rPr>
-        <w:t xml:space="preserve">lens fibres</w:t>
+        <w:t xml:space="preserve">lens fibers</w:t>
       </w:r>
       <w:r>
         <w:t xml:space="preserve"> </w:t>
@@ -41871,7 +42380,7 @@
         <w:t xml:space="preserve">crystallins</w:t>
       </w:r>
       <w:r>
-        <w:t xml:space="preserve">, without organelles). New fibres are added at the equator throughout life, so the lens grows and its nucleus becomes denser. Loss of transparency is</w:t>
+        <w:t xml:space="preserve">, without organelles). New fibers are added at the equator throughout life, so the lens grows and its nucleus becomes denser. Loss of transparency is</w:t>
       </w:r>
       <w:r>
         <w:t xml:space="preserve"> </w:t>
@@ -42020,7 +42529,7 @@
               <w:t xml:space="preserve"> </w:t>
             </w:r>
             <w:r>
-              <w:t xml:space="preserve">(iodopsin, colour, ~6 million)</w:t>
+              <w:t xml:space="preserve">(iodopsin, color, ~6 million)</w:t>
             </w:r>
           </w:p>
         </w:tc>
@@ -42144,7 +42653,7 @@
         <w:t xml:space="preserve"> </w:t>
       </w:r>
       <w:r>
-        <w:t xml:space="preserve">— and its centre, the</w:t>
+        <w:t xml:space="preserve">— and its center, the</w:t>
       </w:r>
       <w:r>
         <w:t xml:space="preserve"> </w:t>
@@ -42746,7 +43255,7 @@
         <w:t xml:space="preserve"> </w:t>
       </w:r>
       <w:r>
-        <w:t xml:space="preserve">— microvascular damage with haemorrhage and neovascularisation.</w:t>
+        <w:t xml:space="preserve">— microvascular damage with hemorrhage and neovascularisation.</w:t>
       </w:r>
       <w:r>
         <w:t xml:space="preserve"> </w:t>
@@ -42901,7 +43410,7 @@
           <w:b/>
           <w:bCs/>
         </w:rPr>
-        <w:t xml:space="preserve">colour and detail</w:t>
+        <w:t xml:space="preserve">color and detail</w:t>
       </w:r>
       <w:r>
         <w:t xml:space="preserve">; the</w:t>
@@ -42917,7 +43426,7 @@
         <w:t xml:space="preserve">fovea has only cones</w:t>
       </w:r>
       <w:r>
-        <w:t xml:space="preserve">, which is why acuity is highest there and colour vision is lost first in the periphery.</w:t>
+        <w:t xml:space="preserve">, which is why acuity is highest there and color vision is lost first in the periphery.</w:t>
       </w:r>
     </w:p>
     <w:bookmarkEnd w:id="198"/>
@@ -43055,7 +43564,7 @@
         <w:t xml:space="preserve"> </w:t>
       </w:r>
       <w:r>
-        <w:t xml:space="preserve">→ oesophagus, oral cavity, vagina, anal canal, epidermis (no lumen).</w:t>
+        <w:t xml:space="preserve">→ esophagus, oral cavity, vagina, anal canal, epidermis (no lumen).</w:t>
       </w:r>
       <w:r>
         <w:t xml:space="preserve"> </w:t>
@@ -43503,7 +44012,7 @@
               <w:pStyle w:val="Compact"/>
             </w:pPr>
             <w:r>
-              <w:t xml:space="preserve">Oral cavity, oesophagus, vagina, cornea, anal canal</w:t>
+              <w:t xml:space="preserve">Oral cavity, esophagus, vagina, cornea, anal canal</w:t>
             </w:r>
           </w:p>
         </w:tc>
@@ -45335,7 +45844,7 @@
               <w:pStyle w:val="Compact"/>
             </w:pPr>
             <w:r>
-              <w:t xml:space="preserve">Oesophagus</w:t>
+              <w:t xml:space="preserve">Esophagus</w:t>
             </w:r>
           </w:p>
         </w:tc>
@@ -45719,7 +46228,7 @@
               <w:pStyle w:val="Compact"/>
             </w:pPr>
             <w:r>
-              <w:t xml:space="preserve">Adrenaline</w:t>
+              <w:t xml:space="preserve">Epinephrine</w:t>
             </w:r>
           </w:p>
         </w:tc>
@@ -46123,7 +46632,7 @@
         </w:numPr>
       </w:pPr>
       <w:r>
-        <w:t xml:space="preserve">Basophilic = binds haematoxylin = nucleic acid.</w:t>
+        <w:t xml:space="preserve">Basophilic = binds hematoxylin = nucleic acid.</w:t>
       </w:r>
     </w:p>
     <w:p>
@@ -47035,7 +47544,7 @@
         </w:numPr>
       </w:pPr>
       <w:r>
-        <w:t xml:space="preserve">Purkinje fibres conduct; they are not neurons.</w:t>
+        <w:t xml:space="preserve">Purkinje fibers conduct; they are not neurons.</w:t>
       </w:r>
     </w:p>
     <w:p>
@@ -47155,7 +47664,7 @@
         </w:numPr>
       </w:pPr>
       <w:r>
-        <w:t xml:space="preserve">Monocyte = largest leucocyte.</w:t>
+        <w:t xml:space="preserve">Monocyte = largest leukocyte.</w:t>
       </w:r>
     </w:p>
     <w:p>
@@ -47251,7 +47760,7 @@
         </w:numPr>
       </w:pPr>
       <w:r>
-        <w:t xml:space="preserve">Germinal centre = B-cell proliferation.</w:t>
+        <w:t xml:space="preserve">Germinal center = B-cell proliferation.</w:t>
       </w:r>
     </w:p>
     <w:p>
@@ -48223,7 +48732,7 @@
               <w:pStyle w:val="Compact"/>
             </w:pPr>
             <w:r>
-              <w:t xml:space="preserve">Dim light versus colour and acuity</w:t>
+              <w:t xml:space="preserve">Dim light versus color and acuity</w:t>
             </w:r>
           </w:p>
         </w:tc>
@@ -48363,7 +48872,7 @@
           <w:b/>
           <w:bCs/>
         </w:rPr>
-        <w:t xml:space="preserve">haematopoietic</w:t>
+        <w:t xml:space="preserve">hematopoietic</w:t>
       </w:r>
       <w:r>
         <w:t xml:space="preserve">.</w:t>
@@ -48604,7 +49113,7 @@
               <w:pStyle w:val="Compact"/>
             </w:pPr>
             <w:r>
-              <w:t xml:space="preserve">Colour</w:t>
+              <w:t xml:space="preserve">Color</w:t>
             </w:r>
           </w:p>
         </w:tc>
@@ -48632,7 +49141,7 @@
                 <w:b/>
                 <w:bCs/>
               </w:rPr>
-              <w:t xml:space="preserve">Haematoxylin</w:t>
+              <w:t xml:space="preserve">Hematoxylin</w:t>
             </w:r>
           </w:p>
         </w:tc>
@@ -48843,7 +49352,7 @@
               <w:pStyle w:val="Compact"/>
             </w:pPr>
             <w:r>
-              <w:t xml:space="preserve">Type III collagen, nerve fibres</w:t>
+              <w:t xml:space="preserve">Type III collagen, nerve fibers</w:t>
             </w:r>
           </w:p>
         </w:tc>
@@ -49143,7 +49652,7 @@
               <w:pStyle w:val="Compact"/>
             </w:pPr>
             <w:r>
-              <w:t xml:space="preserve">Iron (haemosiderin)</w:t>
+              <w:t xml:space="preserve">Iron (hemosiderin)</w:t>
             </w:r>
           </w:p>
         </w:tc>
@@ -49165,7 +49674,7 @@
               <w:pStyle w:val="Compact"/>
             </w:pPr>
             <w:r>
-              <w:t xml:space="preserve">Iron overload, old haemorrhage</w:t>
+              <w:t xml:space="preserve">Iron overload, old hemorrhage</w:t>
             </w:r>
           </w:p>
         </w:tc>
@@ -49365,7 +49874,7 @@
               <w:pStyle w:val="Compact"/>
             </w:pPr>
             <w:r>
-              <w:t xml:space="preserve">Tumour typing, cell identification</w:t>
+              <w:t xml:space="preserve">Tumor typing, cell identification</w:t>
             </w:r>
           </w:p>
         </w:tc>
@@ -50048,7 +50557,7 @@
         <w:t xml:space="preserve"> </w:t>
       </w:r>
       <w:r>
-        <w:t xml:space="preserve">A. Collagen bundles B. Nuclei and rough endoplasmic reticulum C. Erythrocytes D. Elastic fibres</w:t>
+        <w:t xml:space="preserve">A. Collagen bundles B. Nuclei and rough endoplasmic reticulum C. Erythrocytes D. Elastic fibers</w:t>
       </w:r>
     </w:p>
     <w:p>
@@ -50138,7 +50647,7 @@
         <w:t xml:space="preserve"> </w:t>
       </w:r>
       <w:r>
-        <w:t xml:space="preserve">Which technique localises a specific protein in a tissue section using an antibody?</w:t>
+        <w:t xml:space="preserve">Which technique localizes a specific protein in a tissue section using an antibody?</w:t>
       </w:r>
       <w:r>
         <w:t xml:space="preserve"> </w:t>
@@ -50162,7 +50671,7 @@
         <w:t xml:space="preserve"> </w:t>
       </w:r>
       <w:r>
-        <w:t xml:space="preserve">A cell specialised for steroid hormone synthesis would show abundant:</w:t>
+        <w:t xml:space="preserve">A cell specialized for steroid hormone synthesis would show abundant:</w:t>
       </w:r>
       <w:r>
         <w:t xml:space="preserve"> </w:t>
@@ -50306,7 +50815,7 @@
         <w:t xml:space="preserve"> </w:t>
       </w:r>
       <w:r>
-        <w:t xml:space="preserve">The nucleolar organiser regions are located on which chromosomes?</w:t>
+        <w:t xml:space="preserve">The nucleolar organizer regions are located on which chromosomes?</w:t>
       </w:r>
       <w:r>
         <w:t xml:space="preserve"> </w:t>
@@ -50724,7 +51233,7 @@
         <w:t xml:space="preserve"> </w:t>
       </w:r>
       <w:r>
-        <w:t xml:space="preserve">The primary ossification centre of a long bone appears in the:</w:t>
+        <w:t xml:space="preserve">The primary ossification center of a long bone appears in the:</w:t>
       </w:r>
       <w:r>
         <w:t xml:space="preserve"> </w:t>
@@ -50772,13 +51281,13 @@
         <w:t xml:space="preserve"> </w:t>
       </w:r>
       <w:r>
-        <w:t xml:space="preserve">Dense regular connective tissue is characterised by:</w:t>
-      </w:r>
-      <w:r>
-        <w:t xml:space="preserve"> </w:t>
-      </w:r>
-      <w:r>
-        <w:t xml:space="preserve">A. Randomly oriented collagen bundles B. Parallel collagen bundles C. Abundant elastic fibres D. A reticular network</w:t>
+        <w:t xml:space="preserve">Dense regular connective tissue is characterized by:</w:t>
+      </w:r>
+      <w:r>
+        <w:t xml:space="preserve"> </w:t>
+      </w:r>
+      <w:r>
+        <w:t xml:space="preserve">A. Randomly oriented collagen bundles B. Parallel collagen bundles C. Abundant elastic fibers D. A reticular network</w:t>
       </w:r>
     </w:p>
     <w:p>
@@ -50796,7 +51305,7 @@
         <w:t xml:space="preserve"> </w:t>
       </w:r>
       <w:r>
-        <w:t xml:space="preserve">Which tissue is the site of haematopoiesis in the adult?</w:t>
+        <w:t xml:space="preserve">Which tissue is the site of hematopoiesis in the adult?</w:t>
       </w:r>
       <w:r>
         <w:t xml:space="preserve"> </w:t>
@@ -51094,7 +51603,7 @@
         <w:t xml:space="preserve"> </w:t>
       </w:r>
       <w:r>
-        <w:t xml:space="preserve">A muscle fibre that is rich in mitochondria and myoglobin and resistant to fatigue is:</w:t>
+        <w:t xml:space="preserve">A muscle fiber that is rich in mitochondria and myoglobin and resistant to fatigue is:</w:t>
       </w:r>
       <w:r>
         <w:t xml:space="preserve"> </w:t>
@@ -51104,13 +51613,13 @@
       </w:r>
     </w:p>
     <w:bookmarkEnd w:id="212"/>
-    <w:bookmarkStart w:id="213" w:name="blood-haemopoiesis-and-immunity-4560"/>
+    <w:bookmarkStart w:id="213" w:name="blood-hemopoiesis-and-immunity-4560"/>
     <w:p>
       <w:pPr>
         <w:pStyle w:val="Heading3"/>
       </w:pPr>
       <w:r>
-        <w:t xml:space="preserve">Blood, haemopoiesis and immunity (45–60)</w:t>
+        <w:t xml:space="preserve">Blood, hemopoiesis and immunity (45–60)</w:t>
       </w:r>
     </w:p>
     <w:p>
@@ -51128,7 +51637,7 @@
         <w:t xml:space="preserve"> </w:t>
       </w:r>
       <w:r>
-        <w:t xml:space="preserve">The most abundant leucocyte in normal peripheral blood is the:</w:t>
+        <w:t xml:space="preserve">The most abundant leukocyte in normal peripheral blood is the:</w:t>
       </w:r>
       <w:r>
         <w:t xml:space="preserve"> </w:t>
@@ -51176,7 +51685,7 @@
         <w:t xml:space="preserve"> </w:t>
       </w:r>
       <w:r>
-        <w:t xml:space="preserve">The largest leucocyte, with a kidney-shaped nucleus, is the:</w:t>
+        <w:t xml:space="preserve">The largest leukocyte, with a kidney-shaped nucleus, is the:</w:t>
       </w:r>
       <w:r>
         <w:t xml:space="preserve"> </w:t>
@@ -51296,7 +51805,7 @@
         <w:t xml:space="preserve"> </w:t>
       </w:r>
       <w:r>
-        <w:t xml:space="preserve">CD4-positive T cells recognise antigen presented by:</w:t>
+        <w:t xml:space="preserve">CD4-positive T cells recognize antigen presented by:</w:t>
       </w:r>
       <w:r>
         <w:t xml:space="preserve"> </w:t>
@@ -51392,7 +51901,7 @@
         <w:t xml:space="preserve"> </w:t>
       </w:r>
       <w:r>
-        <w:t xml:space="preserve">A germinal centre is a site of:</w:t>
+        <w:t xml:space="preserve">A germinal center is a site of:</w:t>
       </w:r>
       <w:r>
         <w:t xml:space="preserve"> </w:t>
@@ -51464,7 +51973,7 @@
         <w:t xml:space="preserve"> </w:t>
       </w:r>
       <w:r>
-        <w:t xml:space="preserve">Neonatal haemopoiesis occurs mainly in the:</w:t>
+        <w:t xml:space="preserve">Neonatal hemopoiesis occurs mainly in the:</w:t>
       </w:r>
       <w:r>
         <w:t xml:space="preserve"> </w:t>
@@ -51786,7 +52295,7 @@
         <w:t xml:space="preserve"> </w:t>
       </w:r>
       <w:r>
-        <w:t xml:space="preserve">The oesophagus is lined by:</w:t>
+        <w:t xml:space="preserve">The esophagus is lined by:</w:t>
       </w:r>
       <w:r>
         <w:t xml:space="preserve"> </w:t>
@@ -51820,7 +52329,7 @@
         <w:t xml:space="preserve"> </w:t>
       </w:r>
       <w:r>
-        <w:t xml:space="preserve">Type II pneumocytes are characterised by:</w:t>
+        <w:t xml:space="preserve">Type II pneumocytes are characterized by:</w:t>
       </w:r>
       <w:r>
         <w:t xml:space="preserve"> </w:t>
@@ -52244,7 +52753,7 @@
         <w:t xml:space="preserve"> </w:t>
       </w:r>
       <w:r>
-        <w:t xml:space="preserve">A. Aldosterone B. Cortisol C. Androgens D. Adrenaline</w:t>
+        <w:t xml:space="preserve">A. Aldosterone B. Cortisol C. Androgens D. Epinephrine</w:t>
       </w:r>
     </w:p>
     <w:p>
@@ -52523,7 +53032,7 @@
         <w:t xml:space="preserve"> </w:t>
       </w:r>
       <w:r>
-        <w:t xml:space="preserve">— Basic dyes such as haematoxylin bind acidic structures, and nucleic acids (nucleus, rough ER) are the most acidic components of the cell.</w:t>
+        <w:t xml:space="preserve">— Basic dyes such as hematoxylin bind acidic structures, and nucleic acids (nucleus, rough ER) are the most acidic components of the cell.</w:t>
       </w:r>
     </w:p>
     <w:p>
@@ -52595,7 +53104,7 @@
         <w:t xml:space="preserve"> </w:t>
       </w:r>
       <w:r>
-        <w:t xml:space="preserve">— Immunohistochemistry uses a specific antibody, visualised by an enzyme reaction or a fluorophore.</w:t>
+        <w:t xml:space="preserve">— Immunohistochemistry uses a specific antibody, visualized by an enzyme reaction or a fluorophore.</w:t>
       </w:r>
     </w:p>
     <w:p>
@@ -52721,7 +53230,7 @@
         <w:t xml:space="preserve"> </w:t>
       </w:r>
       <w:r>
-        <w:t xml:space="preserve">— The acrocentric chromosomes 13, 14, 15, 21, and 22 carry the nucleolar organiser regions.</w:t>
+        <w:t xml:space="preserve">— The acrocentric chromosomes 13, 14, 15, 21, and 22 carry the nucleolar organizer regions.</w:t>
       </w:r>
     </w:p>
     <w:p>
@@ -53027,7 +53536,7 @@
         <w:t xml:space="preserve"> </w:t>
       </w:r>
       <w:r>
-        <w:t xml:space="preserve">— The primary centre appears in the diaphysis; secondary centres appear in the epiphyses.</w:t>
+        <w:t xml:space="preserve">— The primary center appears in the diaphysis; secondary centers appear in the epiphyses.</w:t>
       </w:r>
     </w:p>
     <w:p>
@@ -53081,7 +53590,7 @@
         <w:t xml:space="preserve"> </w:t>
       </w:r>
       <w:r>
-        <w:t xml:space="preserve">— Red bone marrow is the adult haematopoietic site.</w:t>
+        <w:t xml:space="preserve">— Red bone marrow is the adult hematopoietic site.</w:t>
       </w:r>
     </w:p>
     <w:p>
@@ -53171,7 +53680,7 @@
         <w:t xml:space="preserve"> </w:t>
       </w:r>
       <w:r>
-        <w:t xml:space="preserve">— Endoneurium surrounds individual nerve fibres; perineurium surrounds fascicles.</w:t>
+        <w:t xml:space="preserve">— Endoneurium surrounds individual nerve fibers; perineurium surrounds fascicles.</w:t>
       </w:r>
     </w:p>
     <w:p>
@@ -53297,7 +53806,7 @@
         <w:t xml:space="preserve"> </w:t>
       </w:r>
       <w:r>
-        <w:t xml:space="preserve">— Type I fibres are slow, oxidative, and fatigue-resistant.</w:t>
+        <w:t xml:space="preserve">— Type I fibers are slow, oxidative, and fatigue-resistant.</w:t>
       </w:r>
     </w:p>
     <w:p>
@@ -53315,7 +53824,7 @@
         <w:t xml:space="preserve"> </w:t>
       </w:r>
       <w:r>
-        <w:t xml:space="preserve">— Neutrophils constitute 60–70% of circulating leucocytes.</w:t>
+        <w:t xml:space="preserve">— Neutrophils constitute 60–70% of circulating leukocytes.</w:t>
       </w:r>
     </w:p>
     <w:p>
@@ -53351,7 +53860,7 @@
         <w:t xml:space="preserve"> </w:t>
       </w:r>
       <w:r>
-        <w:t xml:space="preserve">— The monocyte is the largest leucocyte and has a kidney-shaped nucleus.</w:t>
+        <w:t xml:space="preserve">— The monocyte is the largest leukocyte and has a kidney-shaped nucleus.</w:t>
       </w:r>
     </w:p>
     <w:p>
@@ -53441,7 +53950,7 @@
         <w:t xml:space="preserve"> </w:t>
       </w:r>
       <w:r>
-        <w:t xml:space="preserve">— CD4⁺ helper T cells recognise antigen on MHC class II.</w:t>
+        <w:t xml:space="preserve">— CD4⁺ helper T cells recognize antigen on MHC class II.</w:t>
       </w:r>
     </w:p>
     <w:p>
@@ -53513,7 +54022,7 @@
         <w:t xml:space="preserve"> </w:t>
       </w:r>
       <w:r>
-        <w:t xml:space="preserve">— Germinal centres are sites of B-cell proliferation and affinity maturation.</w:t>
+        <w:t xml:space="preserve">— Germinal centers are sites of B-cell proliferation and affinity maturation.</w:t>
       </w:r>
     </w:p>
     <w:p>
@@ -53567,7 +54076,7 @@
         <w:t xml:space="preserve"> </w:t>
       </w:r>
       <w:r>
-        <w:t xml:space="preserve">— In the second trimester, the liver and spleen are the main haemopoietic organs.</w:t>
+        <w:t xml:space="preserve">— In the second trimester, the liver and spleen are the main hemopoietic organs.</w:t>
       </w:r>
     </w:p>
     <w:p>
@@ -53711,7 +54220,7 @@
         <w:t xml:space="preserve"> </w:t>
       </w:r>
       <w:r>
-        <w:t xml:space="preserve">— The central vein is at the centre of the lobule, not in the portal triad.</w:t>
+        <w:t xml:space="preserve">— The central vein is at the center of the lobule, not in the portal triad.</w:t>
       </w:r>
     </w:p>
     <w:p>
@@ -53801,7 +54310,7 @@
         <w:t xml:space="preserve"> </w:t>
       </w:r>
       <w:r>
-        <w:t xml:space="preserve">— The oesophagus is lined by stratified squamous non-keratinised epithelium.</w:t>
+        <w:t xml:space="preserve">— The esophagus is lined by stratified squamous non-keratinised epithelium.</w:t>
       </w:r>
     </w:p>
     <w:p>
@@ -54269,7 +54778,7 @@
         <w:t xml:space="preserve"> </w:t>
       </w:r>
       <w:r>
-        <w:t xml:space="preserve">— The fovea contains cones only, giving maximal acuity and colour vision.</w:t>
+        <w:t xml:space="preserve">— The fovea contains cones only, giving maximal acuity and color vision.</w:t>
       </w:r>
     </w:p>
     <w:p>

</xml_diff>